<commit_message>
feat(vircle-chat): no GIF picker: the app only shows GIFs that arrive; simulator agent can send one; documents updated
- simulator: removed the GIF panel and GIPHY option from the phone; the Agent tab sends a sample GIF (animated MP4); scenario updated
- design document, protocol, contract and library README now say: no picker, no GIF service key, display only; agents cannot post
  GIFs from Halo yet (decision pending)

Co-Authored-By: Claude Sonnet 5.5 <noreply@anthropic.com>
</commit_message>
<xml_diff>
--- a/docs/vircle-chat-app-design.docx
+++ b/docs/vircle-chat-app-design.docx
@@ -170,7 +170,7 @@
         <w:t xml:space="preserve"> </w:t>
       </w:r>
       <w:r>
-        <w:t xml:space="preserve">device-specific parts a library cannot do: picking photos, recording a voice note, showing emoji and GIF pickers, and handling a push</w:t>
+        <w:t xml:space="preserve">device-specific parts a library cannot do: picking photos, recording a voice note, showing an emoji picker, and handling a push</w:t>
       </w:r>
       <w:r>
         <w:t xml:space="preserve"> </w:t>
@@ -414,7 +414,7 @@
               <w:pStyle w:val="Compact"/>
             </w:pPr>
             <w:r>
-              <w:t xml:space="preserve">GIF picker key</w:t>
+              <w:t xml:space="preserve">GIFs</w:t>
             </w:r>
           </w:p>
         </w:tc>
@@ -429,10 +429,13 @@
                 <w:b/>
                 <w:bCs/>
               </w:rPr>
-              <w:t xml:space="preserve">Needs a decision</w:t>
-            </w:r>
-            <w:r>
-              <w:t xml:space="preserve">: Tenor’s API was shut down on 30 June 2026; GIPHY is the recommended replacement (section 10)</w:t>
+              <w:t xml:space="preserve">No picker and no GIF service in version 1.</w:t>
+            </w:r>
+            <w:r>
+              <w:t xml:space="preserve"> </w:t>
+            </w:r>
+            <w:r>
+              <w:t xml:space="preserve">The app only has to show a GIF when one arrives (section 10)</w:t>
             </w:r>
           </w:p>
         </w:tc>
@@ -841,30 +844,18 @@
                 <w:b/>
                 <w:bCs/>
               </w:rPr>
-              <w:t xml:space="preserve">Yes</w:t>
-            </w:r>
-          </w:p>
-        </w:tc>
-        <w:tc>
-          <w:tcPr/>
-          <w:p>
-            <w:pPr>
-              <w:pStyle w:val="Compact"/>
-            </w:pPr>
-            <w:r>
-              <w:t xml:space="preserve">You pick it; library:</w:t>
-            </w:r>
-            <w:r>
-              <w:t xml:space="preserve"> </w:t>
-            </w:r>
-            <w:r>
-              <w:rPr>
-                <w:rStyle w:val="VerbatimChar"/>
-              </w:rPr>
-              <w:t xml:space="preserve">sendGif</w:t>
-            </w:r>
-            <w:r>
-              <w:t xml:space="preserve">. Sent as a looping MP4 (section 10)</w:t>
+              <w:t xml:space="preserve">Shown when one arrives</w:t>
+            </w:r>
+          </w:p>
+        </w:tc>
+        <w:tc>
+          <w:tcPr/>
+          <w:p>
+            <w:pPr>
+              <w:pStyle w:val="Compact"/>
+            </w:pPr>
+            <w:r>
+              <w:t xml:space="preserve">You draw it as a looping picture (section 10). No GIF picker and no GIF service key</w:t>
             </w:r>
           </w:p>
         </w:tc>
@@ -3438,57 +3429,6 @@
           </w:p>
         </w:tc>
       </w:tr>
-      <w:tr>
-        <w:tc>
-          <w:tcPr/>
-          <w:p>
-            <w:pPr>
-              <w:pStyle w:val="Compact"/>
-            </w:pPr>
-            <w:r>
-              <w:t xml:space="preserve">GIF service key</w:t>
-            </w:r>
-          </w:p>
-        </w:tc>
-        <w:tc>
-          <w:tcPr/>
-          <w:p>
-            <w:pPr>
-              <w:pStyle w:val="Compact"/>
-            </w:pPr>
-            <w:r>
-              <w:t xml:space="preserve">the key from the GIF provider</w:t>
-            </w:r>
-          </w:p>
-        </w:tc>
-        <w:tc>
-          <w:tcPr/>
-          <w:p>
-            <w:pPr>
-              <w:pStyle w:val="Compact"/>
-            </w:pPr>
-            <w:r>
-              <w:t xml:space="preserve">Section 10. A public client key,</w:t>
-            </w:r>
-            <w:r>
-              <w:t xml:space="preserve"> </w:t>
-            </w:r>
-            <w:r>
-              <w:rPr>
-                <w:b/>
-                <w:bCs/>
-              </w:rPr>
-              <w:t xml:space="preserve">not</w:t>
-            </w:r>
-            <w:r>
-              <w:t xml:space="preserve"> </w:t>
-            </w:r>
-            <w:r>
-              <w:t xml:space="preserve">from Halo</w:t>
-            </w:r>
-          </w:p>
-        </w:tc>
-      </w:tr>
     </w:tbl>
     <w:bookmarkEnd w:id="14"/>
     <w:bookmarkStart w:id="15" w:name="test-and-live-environments"/>
@@ -5092,7 +5032,7 @@
         <w:rPr>
           <w:rStyle w:val="VerbatimChar"/>
         </w:rPr>
-        <w:t xml:space="preserve">overlays          attach menu (ion-action-sheet or popover), emoji picker and GIF picker (ion-modal, bottom sheet),</w:t>
+        <w:t xml:space="preserve">overlays          attach menu (ion-action-sheet or popover), emoji picker (ion-modal, bottom sheet),</w:t>
       </w:r>
       <w:r>
         <w:br/>
@@ -9982,63 +9922,6 @@
           </w:p>
         </w:tc>
       </w:tr>
-      <w:tr>
-        <w:tc>
-          <w:tcPr/>
-          <w:p>
-            <w:pPr>
-              <w:pStyle w:val="Compact"/>
-            </w:pPr>
-            <w:r>
-              <w:rPr>
-                <w:b/>
-                <w:bCs/>
-              </w:rPr>
-              <w:t xml:space="preserve">GIF</w:t>
-            </w:r>
-          </w:p>
-        </w:tc>
-        <w:tc>
-          <w:tcPr/>
-          <w:p>
-            <w:pPr>
-              <w:pStyle w:val="Compact"/>
-            </w:pPr>
-            <w:r>
-              <w:t xml:space="preserve">Your GIF picker (section 10)</w:t>
-            </w:r>
-          </w:p>
-        </w:tc>
-        <w:tc>
-          <w:tcPr/>
-          <w:p>
-            <w:pPr>
-              <w:pStyle w:val="Compact"/>
-            </w:pPr>
-            <w:r>
-              <w:rPr>
-                <w:rStyle w:val="VerbatimChar"/>
-              </w:rPr>
-              <w:t xml:space="preserve">video</w:t>
-            </w:r>
-            <w:r>
-              <w:t xml:space="preserve"> </w:t>
-            </w:r>
-            <w:r>
-              <w:t xml:space="preserve">flagged</w:t>
-            </w:r>
-            <w:r>
-              <w:t xml:space="preserve"> </w:t>
-            </w:r>
-            <w:r>
-              <w:rPr>
-                <w:rStyle w:val="VerbatimChar"/>
-              </w:rPr>
-              <w:t xml:space="preserve">animated</w:t>
-            </w:r>
-          </w:p>
-        </w:tc>
-      </w:tr>
     </w:tbl>
     <w:p>
       <w:pPr>
@@ -10093,7 +9976,7 @@
         <w:t xml:space="preserve"> </w:t>
       </w:r>
       <w:r>
-        <w:t xml:space="preserve">Location, Contact, Poll (not supported by Halo, nor on the web widget).</w:t>
+        <w:t xml:space="preserve">GIF (the app only shows GIFs, section 10), Location, Contact, Poll (not supported by Halo, nor on the web widget).</w:t>
       </w:r>
     </w:p>
     <w:p>
@@ -12246,22 +12129,13 @@
       </w:r>
     </w:p>
     <w:bookmarkEnd w:id="32"/>
-    <w:bookmarkStart w:id="35" w:name="gifs"/>
+    <w:bookmarkStart w:id="35" w:name="gifs-showing-them"/>
     <w:p>
       <w:pPr>
         <w:pStyle w:val="Heading1"/>
       </w:pPr>
       <w:r>
-        <w:t xml:space="preserve">10. GIFs</w:t>
-      </w:r>
-    </w:p>
-    <w:bookmarkStart w:id="33" w:name="how-a-gif-travels"/>
-    <w:p>
-      <w:pPr>
-        <w:pStyle w:val="Heading2"/>
-      </w:pPr>
-      <w:r>
-        <w:t xml:space="preserve">10.1 How a GIF travels</w:t>
+        <w:t xml:space="preserve">10. GIFs: showing them</w:t>
       </w:r>
     </w:p>
     <w:p>
@@ -12269,44 +12143,90 @@
         <w:pStyle w:val="FirstParagraph"/>
       </w:pPr>
       <w:r>
-        <w:t xml:space="preserve">WhatsApp does not send</w:t>
-      </w:r>
-      <w:r>
-        <w:t xml:space="preserve"> </w:t>
-      </w:r>
-      <w:r>
-        <w:rPr>
-          <w:rStyle w:val="VerbatimChar"/>
-        </w:rPr>
-        <w:t xml:space="preserve">.gif</w:t>
-      </w:r>
-      <w:r>
-        <w:t xml:space="preserve"> </w:t>
-      </w:r>
-      <w:r>
-        <w:t xml:space="preserve">files. It converts a GIF to a short</w:t>
-      </w:r>
-      <w:r>
-        <w:t xml:space="preserve"> </w:t>
-      </w:r>
-      <w:r>
         <w:rPr>
           <w:b/>
           <w:bCs/>
         </w:rPr>
+        <w:t xml:space="preserve">Decision (3 October 2026): the app does not create or search for GIFs.</w:t>
+      </w:r>
+      <w:r>
+        <w:t xml:space="preserve"> </w:t>
+      </w:r>
+      <w:r>
+        <w:t xml:space="preserve">There is no GIF button, no GIF picker and no GIF service</w:t>
+      </w:r>
+      <w:r>
+        <w:t xml:space="preserve"> </w:t>
+      </w:r>
+      <w:r>
+        <w:t xml:space="preserve">account or key. What the app must do is</w:t>
+      </w:r>
+      <w:r>
+        <w:t xml:space="preserve"> </w:t>
+      </w:r>
+      <w:r>
+        <w:rPr>
+          <w:b/>
+          <w:bCs/>
+        </w:rPr>
+        <w:t xml:space="preserve">show a GIF properly when one arrives</w:t>
+      </w:r>
+      <w:r>
+        <w:t xml:space="preserve">.</w:t>
+      </w:r>
+    </w:p>
+    <w:bookmarkStart w:id="33" w:name="how-a-gif-arrives"/>
+    <w:p>
+      <w:pPr>
+        <w:pStyle w:val="Heading2"/>
+      </w:pPr>
+      <w:r>
+        <w:t xml:space="preserve">10.1 How a GIF arrives</w:t>
+      </w:r>
+    </w:p>
+    <w:p>
+      <w:pPr>
+        <w:pStyle w:val="FirstParagraph"/>
+      </w:pPr>
+      <w:r>
+        <w:t xml:space="preserve">WhatsApp does not send</w:t>
+      </w:r>
+      <w:r>
+        <w:t xml:space="preserve"> </w:t>
+      </w:r>
+      <w:r>
+        <w:rPr>
+          <w:rStyle w:val="VerbatimChar"/>
+        </w:rPr>
+        <w:t xml:space="preserve">.gif</w:t>
+      </w:r>
+      <w:r>
+        <w:t xml:space="preserve"> </w:t>
+      </w:r>
+      <w:r>
+        <w:t xml:space="preserve">files either. It turns a GIF into a short</w:t>
+      </w:r>
+      <w:r>
+        <w:t xml:space="preserve"> </w:t>
+      </w:r>
+      <w:r>
+        <w:rPr>
+          <w:b/>
+          <w:bCs/>
+        </w:rPr>
         <w:t xml:space="preserve">looping MP4</w:t>
       </w:r>
       <w:r>
         <w:t xml:space="preserve"> </w:t>
       </w:r>
       <w:r>
-        <w:t xml:space="preserve">and marks it so every screen plays it as a muted loop.</w:t>
-      </w:r>
-      <w:r>
-        <w:t xml:space="preserve"> </w:t>
-      </w:r>
-      <w:r>
-        <w:t xml:space="preserve">The Vircle chat does the same:</w:t>
+        <w:t xml:space="preserve">and marks it, so every screen plays it as a</w:t>
+      </w:r>
+      <w:r>
+        <w:t xml:space="preserve"> </w:t>
+      </w:r>
+      <w:r>
+        <w:t xml:space="preserve">muted loop. The Vircle chat carries the same marking:</w:t>
       </w:r>
     </w:p>
     <w:p>
@@ -12318,7 +12238,7 @@
         </w:numPr>
       </w:pPr>
       <w:r>
-        <w:t xml:space="preserve">The user picks a GIF from your GIF picker. GIF services give a</w:t>
+        <w:t xml:space="preserve">The message has</w:t>
       </w:r>
       <w:r>
         <w:t xml:space="preserve"> </w:t>
@@ -12327,39 +12247,39 @@
         <w:rPr>
           <w:rStyle w:val="VerbatimChar"/>
         </w:rPr>
-        <w:t xml:space="preserve">.gif</w:t>
-      </w:r>
-      <w:r>
-        <w:t xml:space="preserve"> </w:t>
-      </w:r>
-      <w:r>
-        <w:t xml:space="preserve">and an</w:t>
-      </w:r>
-      <w:r>
-        <w:t xml:space="preserve"> </w:t>
-      </w:r>
-      <w:r>
-        <w:rPr>
+        <w:t xml:space="preserve">kind: 'video'</w:t>
+      </w:r>
+      <w:r>
+        <w:t xml:space="preserve">,</w:t>
+      </w:r>
+      <w:r>
+        <w:t xml:space="preserve"> </w:t>
+      </w:r>
+      <w:r>
+        <w:rPr>
+          <w:rStyle w:val="VerbatimChar"/>
+        </w:rPr>
+        <w:t xml:space="preserve">media.mimeType: 'video/mp4'</w:t>
+      </w:r>
+      <w:r>
+        <w:t xml:space="preserve"> </w:t>
+      </w:r>
+      <w:r>
+        <w:t xml:space="preserve">and</w:t>
+      </w:r>
+      <w:r>
+        <w:t xml:space="preserve"> </w:t>
+      </w:r>
+      <w:r>
+        <w:rPr>
+          <w:rStyle w:val="VerbatimChar"/>
           <w:b/>
           <w:bCs/>
         </w:rPr>
-        <w:t xml:space="preserve">MP4</w:t>
-      </w:r>
-      <w:r>
-        <w:t xml:space="preserve"> </w:t>
-      </w:r>
-      <w:r>
-        <w:t xml:space="preserve">of the same animation.</w:t>
-      </w:r>
-      <w:r>
-        <w:t xml:space="preserve"> </w:t>
-      </w:r>
-      <w:r>
-        <w:rPr>
-          <w:b/>
-          <w:bCs/>
-        </w:rPr>
-        <w:t xml:space="preserve">Use the MP4.</w:t>
+        <w:t xml:space="preserve">media.animated: true</w:t>
+      </w:r>
+      <w:r>
+        <w:t xml:space="preserve">.</w:t>
       </w:r>
     </w:p>
     <w:p>
@@ -12371,16 +12291,50 @@
         </w:numPr>
       </w:pPr>
       <w:r>
+        <w:t xml:space="preserve">Draw it as</w:t>
+      </w:r>
+      <w:r>
+        <w:t xml:space="preserve"> </w:t>
+      </w:r>
+      <w:r>
         <w:rPr>
           <w:rStyle w:val="VerbatimChar"/>
         </w:rPr>
-        <w:t xml:space="preserve">await chat.sendGif({ url: mp4Url })</w:t>
-      </w:r>
-      <w:r>
-        <w:t xml:space="preserve"> </w:t>
-      </w:r>
-      <w:r>
-        <w:t xml:space="preserve">downloads it and sends it flagged</w:t>
+        <w:t xml:space="preserve">&lt;video autoplay loop muted playsinline&gt;</w:t>
+      </w:r>
+      <w:r>
+        <w:t xml:space="preserve"> </w:t>
+      </w:r>
+      <w:r>
+        <w:t xml:space="preserve">with</w:t>
+      </w:r>
+      <w:r>
+        <w:t xml:space="preserve"> </w:t>
+      </w:r>
+      <w:r>
+        <w:rPr>
+          <w:b/>
+          <w:bCs/>
+        </w:rPr>
+        <w:t xml:space="preserve">no controls</w:t>
+      </w:r>
+      <w:r>
+        <w:t xml:space="preserve"> </w:t>
+      </w:r>
+      <w:r>
+        <w:t xml:space="preserve">and a small</w:t>
+      </w:r>
+      <w:r>
+        <w:t xml:space="preserve"> </w:t>
+      </w:r>
+      <w:r>
+        <w:t xml:space="preserve">“GIF”</w:t>
+      </w:r>
+      <w:r>
+        <w:t xml:space="preserve"> </w:t>
+      </w:r>
+      <w:r>
+        <w:t xml:space="preserve">tag; tapping may open it larger. Without</w:t>
       </w:r>
       <w:r>
         <w:t xml:space="preserve"> </w:t>
@@ -12389,10 +12343,13 @@
         <w:rPr>
           <w:rStyle w:val="VerbatimChar"/>
         </w:rPr>
-        <w:t xml:space="preserve">animated</w:t>
-      </w:r>
-      <w:r>
-        <w:t xml:space="preserve">. (Give</w:t>
+        <w:t xml:space="preserve">muted</w:t>
+      </w:r>
+      <w:r>
+        <w:t xml:space="preserve"> </w:t>
+      </w:r>
+      <w:r>
+        <w:t xml:space="preserve">and</w:t>
       </w:r>
       <w:r>
         <w:t xml:space="preserve"> </w:t>
@@ -12401,34 +12358,10 @@
         <w:rPr>
           <w:rStyle w:val="VerbatimChar"/>
         </w:rPr>
-        <w:t xml:space="preserve">{ blob }</w:t>
-      </w:r>
-      <w:r>
-        <w:t xml:space="preserve"> </w:t>
-      </w:r>
-      <w:r>
-        <w:t xml:space="preserve">instead of</w:t>
-      </w:r>
-      <w:r>
-        <w:t xml:space="preserve"> </w:t>
-      </w:r>
-      <w:r>
-        <w:rPr>
-          <w:rStyle w:val="VerbatimChar"/>
-        </w:rPr>
-        <w:t xml:space="preserve">{ url }</w:t>
-      </w:r>
-      <w:r>
-        <w:t xml:space="preserve"> </w:t>
-      </w:r>
-      <w:r>
-        <w:t xml:space="preserve">if you</w:t>
-      </w:r>
-      <w:r>
-        <w:t xml:space="preserve"> </w:t>
-      </w:r>
-      <w:r>
-        <w:t xml:space="preserve">already hold the bytes.)</w:t>
+        <w:t xml:space="preserve">playsinline</w:t>
+      </w:r>
+      <w:r>
+        <w:t xml:space="preserve">, iPhones will not autoplay it.</w:t>
       </w:r>
     </w:p>
     <w:p>
@@ -12440,7 +12373,22 @@
         </w:numPr>
       </w:pPr>
       <w:r>
-        <w:t xml:space="preserve">Support sees it in Halo’s inbox as a small picture that loops by itself (not a video with a play button).</w:t>
+        <w:t xml:space="preserve">It needs no special handling in the library: it is an ordinary message with a file. Fetch its address with</w:t>
+      </w:r>
+      <w:r>
+        <w:t xml:space="preserve"> </w:t>
+      </w:r>
+      <w:r>
+        <w:rPr>
+          <w:rStyle w:val="VerbatimChar"/>
+        </w:rPr>
+        <w:t xml:space="preserve">chat.getMediaUrl(message.id)</w:t>
+      </w:r>
+      <w:r>
+        <w:t xml:space="preserve"> </w:t>
+      </w:r>
+      <w:r>
+        <w:t xml:space="preserve">as for any file.</w:t>
       </w:r>
     </w:p>
     <w:p>
@@ -12452,7 +12400,7 @@
         </w:numPr>
       </w:pPr>
       <w:r>
-        <w:t xml:space="preserve">A GIF shows in the app like any message:</w:t>
+        <w:t xml:space="preserve">Autoplay in the WebView needs</w:t>
       </w:r>
       <w:r>
         <w:t xml:space="preserve"> </w:t>
@@ -12461,7 +12409,7 @@
         <w:rPr>
           <w:rStyle w:val="VerbatimChar"/>
         </w:rPr>
-        <w:t xml:space="preserve">message.kind === 'video'</w:t>
+        <w:t xml:space="preserve">muted</w:t>
       </w:r>
       <w:r>
         <w:t xml:space="preserve"> </w:t>
@@ -12476,18 +12424,46 @@
         <w:rPr>
           <w:rStyle w:val="VerbatimChar"/>
         </w:rPr>
-        <w:t xml:space="preserve">message.media.animated === true</w:t>
-      </w:r>
-      <w:r>
-        <w:t xml:space="preserve">, drawn as in 7.5.</w:t>
+        <w:t xml:space="preserve">playsinline</w:t>
+      </w:r>
+      <w:r>
+        <w:t xml:space="preserve"> </w:t>
+      </w:r>
+      <w:r>
+        <w:t xml:space="preserve">on the element (as above). If the build is Cordova rather than Capacitor, also</w:t>
+      </w:r>
+      <w:r>
+        <w:t xml:space="preserve"> </w:t>
+      </w:r>
+      <w:r>
+        <w:t xml:space="preserve">set the</w:t>
+      </w:r>
+      <w:r>
+        <w:t xml:space="preserve"> </w:t>
+      </w:r>
+      <w:r>
+        <w:rPr>
+          <w:rStyle w:val="VerbatimChar"/>
+        </w:rPr>
+        <w:t xml:space="preserve">AllowInlineMediaPlayback</w:t>
+      </w:r>
+      <w:r>
+        <w:t xml:space="preserve"> </w:t>
+      </w:r>
+      <w:r>
+        <w:t xml:space="preserve">preference to true so iOS plays it inline.</w:t>
       </w:r>
     </w:p>
     <w:p>
       <w:pPr>
-        <w:pStyle w:val="FirstParagraph"/>
-      </w:pPr>
-      <w:r>
-        <w:t xml:space="preserve">A</w:t>
+        <w:pStyle w:val="Compact"/>
+        <w:numPr>
+          <w:ilvl w:val="0"/>
+          <w:numId w:val="1007"/>
+        </w:numPr>
+      </w:pPr>
+      <w:r>
+        <w:t xml:space="preserve">Also be ready for an ordinary</w:t>
       </w:r>
       <w:r>
         <w:t xml:space="preserve"> </w:t>
@@ -12496,29 +12472,28 @@
         <w:rPr>
           <w:rStyle w:val="VerbatimChar"/>
         </w:rPr>
+        <w:t xml:space="preserve">image</w:t>
+      </w:r>
+      <w:r>
+        <w:t xml:space="preserve"> </w:t>
+      </w:r>
+      <w:r>
+        <w:t xml:space="preserve">message whose file is a</w:t>
+      </w:r>
+      <w:r>
+        <w:t xml:space="preserve"> </w:t>
+      </w:r>
+      <w:r>
+        <w:rPr>
+          <w:rStyle w:val="VerbatimChar"/>
+        </w:rPr>
         <w:t xml:space="preserve">.gif</w:t>
       </w:r>
       <w:r>
         <w:t xml:space="preserve"> </w:t>
       </w:r>
       <w:r>
-        <w:t xml:space="preserve">file chosen from the phone’s gallery is</w:t>
-      </w:r>
-      <w:r>
-        <w:t xml:space="preserve"> </w:t>
-      </w:r>
-      <w:r>
-        <w:rPr>
-          <w:b/>
-          <w:bCs/>
-        </w:rPr>
-        <w:t xml:space="preserve">refused</w:t>
-      </w:r>
-      <w:r>
-        <w:t xml:space="preserve"> </w:t>
-      </w:r>
-      <w:r>
-        <w:t xml:space="preserve">by the library with the error</w:t>
+        <w:t xml:space="preserve">or</w:t>
       </w:r>
       <w:r>
         <w:t xml:space="preserve"> </w:t>
@@ -12527,19 +12502,10 @@
         <w:rPr>
           <w:rStyle w:val="VerbatimChar"/>
         </w:rPr>
-        <w:t xml:space="preserve">gif_must_be_mp4</w:t>
-      </w:r>
-      <w:r>
-        <w:t xml:space="preserve"> </w:t>
-      </w:r>
-      <w:r>
-        <w:t xml:space="preserve">and a plain-language message</w:t>
-      </w:r>
-      <w:r>
-        <w:t xml:space="preserve"> </w:t>
-      </w:r>
-      <w:r>
-        <w:t xml:space="preserve">(from</w:t>
+        <w:t xml:space="preserve">.webp</w:t>
+      </w:r>
+      <w:r>
+        <w:t xml:space="preserve">: an</w:t>
       </w:r>
       <w:r>
         <w:t xml:space="preserve"> </w:t>
@@ -12548,143 +12514,29 @@
         <w:rPr>
           <w:rStyle w:val="VerbatimChar"/>
         </w:rPr>
-        <w:t xml:space="preserve">sendFile</w:t>
-      </w:r>
-      <w:r>
-        <w:t xml:space="preserve"> </w:t>
-      </w:r>
-      <w:r>
-        <w:t xml:space="preserve">and from</w:t>
-      </w:r>
-      <w:r>
-        <w:t xml:space="preserve"> </w:t>
-      </w:r>
-      <w:r>
-        <w:rPr>
-          <w:rStyle w:val="VerbatimChar"/>
-        </w:rPr>
-        <w:t xml:space="preserve">sendGif</w:t>
-      </w:r>
-      <w:r>
-        <w:t xml:space="preserve">). The attach menu’s</w:t>
-      </w:r>
-      <w:r>
-        <w:t xml:space="preserve"> </w:t>
-      </w:r>
-      <w:r>
-        <w:t xml:space="preserve">“Photos &amp; videos”</w:t>
-      </w:r>
-      <w:r>
-        <w:t xml:space="preserve"> </w:t>
-      </w:r>
-      <w:r>
-        <w:t xml:space="preserve">should therefore</w:t>
-      </w:r>
-      <w:r>
-        <w:t xml:space="preserve"> </w:t>
-      </w:r>
-      <w:r>
-        <w:rPr>
-          <w:b/>
-          <w:bCs/>
-        </w:rPr>
-        <w:t xml:space="preserve">hide GIF files</w:t>
-      </w:r>
-      <w:r>
-        <w:t xml:space="preserve"> </w:t>
-      </w:r>
-      <w:r>
-        <w:t xml:space="preserve">or convert them first.</w:t>
+        <w:t xml:space="preserve">&lt;img&gt;</w:t>
+      </w:r>
+      <w:r>
+        <w:t xml:space="preserve"> </w:t>
+      </w:r>
+      <w:r>
+        <w:t xml:space="preserve">element animates it by itself, so the</w:t>
+      </w:r>
+      <w:r>
+        <w:t xml:space="preserve"> </w:t>
+      </w:r>
+      <w:r>
+        <w:t xml:space="preserve">normal photo bubble already shows it.</w:t>
       </w:r>
     </w:p>
     <w:bookmarkEnd w:id="33"/>
-    <w:bookmarkStart w:id="34" w:name="the-gif-picker-you-build-it"/>
+    <w:bookmarkStart w:id="34" w:name="who-can-post-a-gif-today"/>
     <w:p>
       <w:pPr>
         <w:pStyle w:val="Heading2"/>
       </w:pPr>
       <w:r>
-        <w:t xml:space="preserve">10.2 The GIF picker (you build it)</w:t>
-      </w:r>
-    </w:p>
-    <w:p>
-      <w:pPr>
-        <w:pStyle w:val="FirstParagraph"/>
-      </w:pPr>
-      <w:r>
-        <w:t xml:space="preserve">A bottom sheet with a search box, a</w:t>
-      </w:r>
-      <w:r>
-        <w:t xml:space="preserve"> </w:t>
-      </w:r>
-      <w:r>
-        <w:rPr>
-          <w:b/>
-          <w:bCs/>
-        </w:rPr>
-        <w:t xml:space="preserve">Trending</w:t>
-      </w:r>
-      <w:r>
-        <w:t xml:space="preserve"> </w:t>
-      </w:r>
-      <w:r>
-        <w:t xml:space="preserve">grid (shown when the search is empty), and a grid of results; tapping one sends it.</w:t>
-      </w:r>
-      <w:r>
-        <w:t xml:space="preserve"> </w:t>
-      </w:r>
-      <w:r>
-        <w:t xml:space="preserve">Reference: the simulator’s GIF panel (section 14).</w:t>
-      </w:r>
-    </w:p>
-    <w:p>
-      <w:pPr>
-        <w:pStyle w:val="BodyText"/>
-      </w:pPr>
-      <w:r>
-        <w:rPr>
-          <w:b/>
-          <w:bCs/>
-        </w:rPr>
-        <w:t xml:space="preserve">Provider and key.</w:t>
-      </w:r>
-      <w:r>
-        <w:t xml:space="preserve"> </w:t>
-      </w:r>
-      <w:r>
-        <w:t xml:space="preserve">Tenor’s API</w:t>
-      </w:r>
-      <w:r>
-        <w:t xml:space="preserve"> </w:t>
-      </w:r>
-      <w:r>
-        <w:rPr>
-          <w:b/>
-          <w:bCs/>
-        </w:rPr>
-        <w:t xml:space="preserve">was shut down on 30 June 2026</w:t>
-      </w:r>
-      <w:r>
-        <w:t xml:space="preserve"> </w:t>
-      </w:r>
-      <w:r>
-        <w:t xml:space="preserve">(new keys were disabled in January), so do not use it. Use</w:t>
-      </w:r>
-      <w:r>
-        <w:t xml:space="preserve"> </w:t>
-      </w:r>
-      <w:r>
-        <w:rPr>
-          <w:b/>
-          <w:bCs/>
-        </w:rPr>
-        <w:t xml:space="preserve">GIPHY</w:t>
-      </w:r>
-      <w:r>
-        <w:t xml:space="preserve"> </w:t>
-      </w:r>
-      <w:r>
-        <w:t xml:space="preserve">(recommended) or another provider; the library only needs an MP4 address. With GIPHY:</w:t>
+        <w:t xml:space="preserve">10.2 Who can post a GIF today</w:t>
       </w:r>
     </w:p>
     <w:p>
@@ -12696,44 +12548,38 @@
         </w:numPr>
       </w:pPr>
       <w:r>
-        <w:t xml:space="preserve">Make an account at</w:t>
-      </w:r>
-      <w:r>
-        <w:t xml:space="preserve"> </w:t>
-      </w:r>
-      <w:r>
-        <w:rPr>
-          <w:rStyle w:val="VerbatimChar"/>
-        </w:rPr>
-        <w:t xml:space="preserve">developers.giphy.com</w:t>
-      </w:r>
-      <w:r>
-        <w:t xml:space="preserve">, create an</w:t>
-      </w:r>
-      <w:r>
-        <w:t xml:space="preserve"> </w:t>
-      </w:r>
-      <w:r>
         <w:rPr>
           <w:b/>
           <w:bCs/>
         </w:rPr>
-        <w:t xml:space="preserve">app</w:t>
-      </w:r>
-      <w:r>
-        <w:t xml:space="preserve"> </w:t>
-      </w:r>
-      <w:r>
-        <w:t xml:space="preserve">(type</w:t>
-      </w:r>
-      <w:r>
-        <w:t xml:space="preserve"> </w:t>
-      </w:r>
-      <w:r>
-        <w:t xml:space="preserve">“API”</w:t>
-      </w:r>
-      <w:r>
-        <w:t xml:space="preserve">), and you are given an</w:t>
+        <w:t xml:space="preserve">Support agents in Halo cannot post GIFs yet.</w:t>
+      </w:r>
+      <w:r>
+        <w:t xml:space="preserve"> </w:t>
+      </w:r>
+      <w:r>
+        <w:t xml:space="preserve">The inbox’s attach menu refuses</w:t>
+      </w:r>
+      <w:r>
+        <w:t xml:space="preserve"> </w:t>
+      </w:r>
+      <w:r>
+        <w:rPr>
+          <w:rStyle w:val="VerbatimChar"/>
+        </w:rPr>
+        <w:t xml:space="preserve">.gif</w:t>
+      </w:r>
+      <w:r>
+        <w:t xml:space="preserve"> </w:t>
+      </w:r>
+      <w:r>
+        <w:t xml:space="preserve">files, because it shares the list of types</w:t>
+      </w:r>
+      <w:r>
+        <w:t xml:space="preserve"> </w:t>
+      </w:r>
+      <w:r>
+        <w:t xml:space="preserve">WhatsApp accepts. So today</w:t>
       </w:r>
       <w:r>
         <w:t xml:space="preserve"> </w:t>
@@ -12743,16 +12589,19 @@
           <w:b/>
           <w:bCs/>
         </w:rPr>
-        <w:t xml:space="preserve">API key</w:t>
-      </w:r>
-      <w:r>
-        <w:t xml:space="preserve">. A new key starts in a</w:t>
-      </w:r>
-      <w:r>
-        <w:t xml:space="preserve"> </w:t>
-      </w:r>
-      <w:r>
-        <w:t xml:space="preserve">limited tier; apply for</w:t>
+        <w:t xml:space="preserve">nothing in production produces a GIF for the app to show.</w:t>
+      </w:r>
+      <w:r>
+        <w:t xml:space="preserve"> </w:t>
+      </w:r>
+      <w:r>
+        <w:t xml:space="preserve">The app should still be ready (above), and the</w:t>
+      </w:r>
+      <w:r>
+        <w:t xml:space="preserve"> </w:t>
+      </w:r>
+      <w:r>
+        <w:t xml:space="preserve">simulator’s</w:t>
       </w:r>
       <w:r>
         <w:t xml:space="preserve"> </w:t>
@@ -12762,13 +12611,13 @@
           <w:b/>
           <w:bCs/>
         </w:rPr>
-        <w:t xml:space="preserve">production access</w:t>
-      </w:r>
-      <w:r>
-        <w:t xml:space="preserve"> </w:t>
-      </w:r>
-      <w:r>
-        <w:t xml:space="preserve">before launch. This key is a public client key: it is</w:t>
+        <w:t xml:space="preserve">Agent</w:t>
+      </w:r>
+      <w:r>
+        <w:t xml:space="preserve"> </w:t>
+      </w:r>
+      <w:r>
+        <w:t xml:space="preserve">tab has a</w:t>
       </w:r>
       <w:r>
         <w:t xml:space="preserve"> </w:t>
@@ -12778,29 +12627,13 @@
           <w:b/>
           <w:bCs/>
         </w:rPr>
-        <w:t xml:space="preserve">not</w:t>
-      </w:r>
-      <w:r>
-        <w:t xml:space="preserve"> </w:t>
-      </w:r>
-      <w:r>
-        <w:t xml:space="preserve">generated by Halo and is</w:t>
-      </w:r>
-      <w:r>
-        <w:t xml:space="preserve"> </w:t>
-      </w:r>
-      <w:r>
-        <w:rPr>
-          <w:b/>
-          <w:bCs/>
-        </w:rPr>
-        <w:t xml:space="preserve">not</w:t>
-      </w:r>
-      <w:r>
-        <w:t xml:space="preserve"> </w:t>
-      </w:r>
-      <w:r>
-        <w:t xml:space="preserve">secret, but keep it in the app’s environment settings, not in the code.</w:t>
+        <w:t xml:space="preserve">GIF</w:t>
+      </w:r>
+      <w:r>
+        <w:t xml:space="preserve"> </w:t>
+      </w:r>
+      <w:r>
+        <w:t xml:space="preserve">button that sends one, so you can build and test the display now.</w:t>
       </w:r>
     </w:p>
     <w:p>
@@ -12812,13 +12645,13 @@
         </w:numPr>
       </w:pPr>
       <w:r>
-        <w:t xml:space="preserve">Check GIPHY’s terms before launch: attribution (</w:t>
-      </w:r>
-      <w:r>
-        <w:t xml:space="preserve">“Powered by GIPHY”</w:t>
-      </w:r>
-      <w:r>
-        <w:t xml:space="preserve">) and rate limits apply. Confirm the current terms on their site.</w:t>
+        <w:t xml:space="preserve">If agents should be able to post GIFs (for example to a Vircle Chat or web-widget conversation, not to WhatsApp), that is a small</w:t>
+      </w:r>
+      <w:r>
+        <w:t xml:space="preserve"> </w:t>
+      </w:r>
+      <w:r>
+        <w:t xml:space="preserve">change on the Halo side, and it needs a decision (section 16). The app needs nothing more when it ships.</w:t>
       </w:r>
     </w:p>
     <w:p>
@@ -12830,501 +12663,16 @@
         </w:numPr>
       </w:pPr>
       <w:r>
-        <w:rPr>
-          <w:b/>
-          <w:bCs/>
-        </w:rPr>
-        <w:t xml:space="preserve">Privacy:</w:t>
-      </w:r>
-      <w:r>
-        <w:t xml:space="preserve"> </w:t>
-      </w:r>
-      <w:r>
-        <w:t xml:space="preserve">every search sends the typed words and the phone’s address to the provider. If that matters, make the backend proxy the</w:t>
-      </w:r>
-      <w:r>
-        <w:t xml:space="preserve"> </w:t>
-      </w:r>
-      <w:r>
-        <w:t xml:space="preserve">two calls (it also hides the key); the app then calls</w:t>
-      </w:r>
-      <w:r>
-        <w:t xml:space="preserve"> </w:t>
+        <w:t xml:space="preserve">The library can still send a GIF (</w:t>
       </w:r>
       <w:r>
         <w:rPr>
           <w:rStyle w:val="VerbatimChar"/>
         </w:rPr>
-        <w:t xml:space="preserve">/chat/gifs?q=...</w:t>
-      </w:r>
-      <w:r>
-        <w:t xml:space="preserve">.</w:t>
-      </w:r>
-    </w:p>
-    <w:p>
-      <w:pPr>
-        <w:pStyle w:val="SourceCode"/>
-      </w:pPr>
-      <w:r>
-        <w:rPr>
-          <w:rStyle w:val="KeywordTok"/>
-        </w:rPr>
-        <w:t xml:space="preserve">const</w:t>
-      </w:r>
-      <w:r>
-        <w:rPr>
-          <w:rStyle w:val="NormalTok"/>
-        </w:rPr>
-        <w:t xml:space="preserve"> KEY </w:t>
-      </w:r>
-      <w:r>
-        <w:rPr>
-          <w:rStyle w:val="OperatorTok"/>
-        </w:rPr>
-        <w:t xml:space="preserve">=</w:t>
-      </w:r>
-      <w:r>
-        <w:rPr>
-          <w:rStyle w:val="NormalTok"/>
-        </w:rPr>
-        <w:t xml:space="preserve"> environment</w:t>
-      </w:r>
-      <w:r>
-        <w:rPr>
-          <w:rStyle w:val="OperatorTok"/>
-        </w:rPr>
-        <w:t xml:space="preserve">.</w:t>
-      </w:r>
-      <w:r>
-        <w:rPr>
-          <w:rStyle w:val="AttributeTok"/>
-        </w:rPr>
-        <w:t xml:space="preserve">giphyKey</w:t>
-      </w:r>
-      <w:r>
-        <w:br/>
-      </w:r>
-      <w:r>
-        <w:rPr>
-          <w:rStyle w:val="KeywordTok"/>
-        </w:rPr>
-        <w:t xml:space="preserve">const</w:t>
-      </w:r>
-      <w:r>
-        <w:rPr>
-          <w:rStyle w:val="NormalTok"/>
-        </w:rPr>
-        <w:t xml:space="preserve"> base </w:t>
-      </w:r>
-      <w:r>
-        <w:rPr>
-          <w:rStyle w:val="OperatorTok"/>
-        </w:rPr>
-        <w:t xml:space="preserve">=</w:t>
-      </w:r>
-      <w:r>
-        <w:rPr>
-          <w:rStyle w:val="NormalTok"/>
-        </w:rPr>
-        <w:t xml:space="preserve"> </w:t>
-      </w:r>
-      <w:r>
-        <w:rPr>
-          <w:rStyle w:val="StringTok"/>
-        </w:rPr>
-        <w:t xml:space="preserve">'https://api.giphy.com/v1/gifs'</w:t>
-      </w:r>
-      <w:r>
-        <w:br/>
-      </w:r>
-      <w:r>
-        <w:rPr>
-          <w:rStyle w:val="KeywordTok"/>
-        </w:rPr>
-        <w:t xml:space="preserve">const</w:t>
-      </w:r>
-      <w:r>
-        <w:rPr>
-          <w:rStyle w:val="NormalTok"/>
-        </w:rPr>
-        <w:t xml:space="preserve"> url </w:t>
-      </w:r>
-      <w:r>
-        <w:rPr>
-          <w:rStyle w:val="OperatorTok"/>
-        </w:rPr>
-        <w:t xml:space="preserve">=</w:t>
-      </w:r>
-      <w:r>
-        <w:rPr>
-          <w:rStyle w:val="NormalTok"/>
-        </w:rPr>
-        <w:t xml:space="preserve"> q </w:t>
-      </w:r>
-      <w:r>
-        <w:rPr>
-          <w:rStyle w:val="OperatorTok"/>
-        </w:rPr>
-        <w:t xml:space="preserve">?</w:t>
-      </w:r>
-      <w:r>
-        <w:rPr>
-          <w:rStyle w:val="NormalTok"/>
-        </w:rPr>
-        <w:t xml:space="preserve"> </w:t>
-      </w:r>
-      <w:r>
-        <w:rPr>
-          <w:rStyle w:val="VerbatimStringTok"/>
-        </w:rPr>
-        <w:t xml:space="preserve">`</w:t>
-      </w:r>
-      <w:r>
-        <w:rPr>
-          <w:rStyle w:val="SpecialCharTok"/>
-        </w:rPr>
-        <w:t xml:space="preserve">${</w:t>
-      </w:r>
-      <w:r>
-        <w:rPr>
-          <w:rStyle w:val="NormalTok"/>
-        </w:rPr>
-        <w:t xml:space="preserve">base</w:t>
-      </w:r>
-      <w:r>
-        <w:rPr>
-          <w:rStyle w:val="SpecialCharTok"/>
-        </w:rPr>
-        <w:t xml:space="preserve">}</w:t>
-      </w:r>
-      <w:r>
-        <w:rPr>
-          <w:rStyle w:val="VerbatimStringTok"/>
-        </w:rPr>
-        <w:t xml:space="preserve">/search?api_key=</w:t>
-      </w:r>
-      <w:r>
-        <w:rPr>
-          <w:rStyle w:val="SpecialCharTok"/>
-        </w:rPr>
-        <w:t xml:space="preserve">${</w:t>
-      </w:r>
-      <w:r>
-        <w:rPr>
-          <w:rStyle w:val="NormalTok"/>
-        </w:rPr>
-        <w:t xml:space="preserve">KEY</w:t>
-      </w:r>
-      <w:r>
-        <w:rPr>
-          <w:rStyle w:val="SpecialCharTok"/>
-        </w:rPr>
-        <w:t xml:space="preserve">}</w:t>
-      </w:r>
-      <w:r>
-        <w:rPr>
-          <w:rStyle w:val="VerbatimStringTok"/>
-        </w:rPr>
-        <w:t xml:space="preserve">&amp;q=</w:t>
-      </w:r>
-      <w:r>
-        <w:rPr>
-          <w:rStyle w:val="SpecialCharTok"/>
-        </w:rPr>
-        <w:t xml:space="preserve">${</w:t>
-      </w:r>
-      <w:r>
-        <w:rPr>
-          <w:rStyle w:val="PreprocessorTok"/>
-        </w:rPr>
-        <w:t xml:space="preserve">encodeURIComponent</w:t>
-      </w:r>
-      <w:r>
-        <w:rPr>
-          <w:rStyle w:val="NormalTok"/>
-        </w:rPr>
-        <w:t xml:space="preserve">(q)</w:t>
-      </w:r>
-      <w:r>
-        <w:rPr>
-          <w:rStyle w:val="SpecialCharTok"/>
-        </w:rPr>
-        <w:t xml:space="preserve">}</w:t>
-      </w:r>
-      <w:r>
-        <w:rPr>
-          <w:rStyle w:val="VerbatimStringTok"/>
-        </w:rPr>
-        <w:t xml:space="preserve">&amp;limit=24&amp;rating=pg&amp;lang=en`</w:t>
-      </w:r>
-      <w:r>
-        <w:br/>
-      </w:r>
-      <w:r>
-        <w:rPr>
-          <w:rStyle w:val="NormalTok"/>
-        </w:rPr>
-        <w:t xml:space="preserve">              </w:t>
-      </w:r>
-      <w:r>
-        <w:rPr>
-          <w:rStyle w:val="OperatorTok"/>
-        </w:rPr>
-        <w:t xml:space="preserve">:</w:t>
-      </w:r>
-      <w:r>
-        <w:rPr>
-          <w:rStyle w:val="NormalTok"/>
-        </w:rPr>
-        <w:t xml:space="preserve"> </w:t>
-      </w:r>
-      <w:r>
-        <w:rPr>
-          <w:rStyle w:val="VerbatimStringTok"/>
-        </w:rPr>
-        <w:t xml:space="preserve">`</w:t>
-      </w:r>
-      <w:r>
-        <w:rPr>
-          <w:rStyle w:val="SpecialCharTok"/>
-        </w:rPr>
-        <w:t xml:space="preserve">${</w:t>
-      </w:r>
-      <w:r>
-        <w:rPr>
-          <w:rStyle w:val="NormalTok"/>
-        </w:rPr>
-        <w:t xml:space="preserve">base</w:t>
-      </w:r>
-      <w:r>
-        <w:rPr>
-          <w:rStyle w:val="SpecialCharTok"/>
-        </w:rPr>
-        <w:t xml:space="preserve">}</w:t>
-      </w:r>
-      <w:r>
-        <w:rPr>
-          <w:rStyle w:val="VerbatimStringTok"/>
-        </w:rPr>
-        <w:t xml:space="preserve">/trending?api_key=</w:t>
-      </w:r>
-      <w:r>
-        <w:rPr>
-          <w:rStyle w:val="SpecialCharTok"/>
-        </w:rPr>
-        <w:t xml:space="preserve">${</w:t>
-      </w:r>
-      <w:r>
-        <w:rPr>
-          <w:rStyle w:val="NormalTok"/>
-        </w:rPr>
-        <w:t xml:space="preserve">KEY</w:t>
-      </w:r>
-      <w:r>
-        <w:rPr>
-          <w:rStyle w:val="SpecialCharTok"/>
-        </w:rPr>
-        <w:t xml:space="preserve">}</w:t>
-      </w:r>
-      <w:r>
-        <w:rPr>
-          <w:rStyle w:val="VerbatimStringTok"/>
-        </w:rPr>
-        <w:t xml:space="preserve">&amp;limit=24&amp;rating=pg`</w:t>
-      </w:r>
-      <w:r>
-        <w:br/>
-      </w:r>
-      <w:r>
-        <w:rPr>
-          <w:rStyle w:val="KeywordTok"/>
-        </w:rPr>
-        <w:t xml:space="preserve">const</w:t>
-      </w:r>
-      <w:r>
-        <w:rPr>
-          <w:rStyle w:val="NormalTok"/>
-        </w:rPr>
-        <w:t xml:space="preserve"> { data } </w:t>
-      </w:r>
-      <w:r>
-        <w:rPr>
-          <w:rStyle w:val="OperatorTok"/>
-        </w:rPr>
-        <w:t xml:space="preserve">=</w:t>
-      </w:r>
-      <w:r>
-        <w:rPr>
-          <w:rStyle w:val="NormalTok"/>
-        </w:rPr>
-        <w:t xml:space="preserve"> </w:t>
-      </w:r>
-      <w:r>
-        <w:rPr>
-          <w:rStyle w:val="ControlFlowTok"/>
-        </w:rPr>
-        <w:t xml:space="preserve">await</w:t>
-      </w:r>
-      <w:r>
-        <w:rPr>
-          <w:rStyle w:val="NormalTok"/>
-        </w:rPr>
-        <w:t xml:space="preserve"> (</w:t>
-      </w:r>
-      <w:r>
-        <w:rPr>
-          <w:rStyle w:val="ControlFlowTok"/>
-        </w:rPr>
-        <w:t xml:space="preserve">await</w:t>
-      </w:r>
-      <w:r>
-        <w:rPr>
-          <w:rStyle w:val="NormalTok"/>
-        </w:rPr>
-        <w:t xml:space="preserve"> </w:t>
-      </w:r>
-      <w:r>
-        <w:rPr>
-          <w:rStyle w:val="FunctionTok"/>
-        </w:rPr>
-        <w:t xml:space="preserve">fetch</w:t>
-      </w:r>
-      <w:r>
-        <w:rPr>
-          <w:rStyle w:val="NormalTok"/>
-        </w:rPr>
-        <w:t xml:space="preserve">(url))</w:t>
-      </w:r>
-      <w:r>
-        <w:rPr>
-          <w:rStyle w:val="OperatorTok"/>
-        </w:rPr>
-        <w:t xml:space="preserve">.</w:t>
-      </w:r>
-      <w:r>
-        <w:rPr>
-          <w:rStyle w:val="FunctionTok"/>
-        </w:rPr>
-        <w:t xml:space="preserve">json</w:t>
-      </w:r>
-      <w:r>
-        <w:rPr>
-          <w:rStyle w:val="NormalTok"/>
-        </w:rPr>
-        <w:t xml:space="preserve">()</w:t>
-      </w:r>
-      <w:r>
-        <w:br/>
-      </w:r>
-      <w:r>
-        <w:rPr>
-          <w:rStyle w:val="CommentTok"/>
-        </w:rPr>
-        <w:t xml:space="preserve">// preview in the grid:  data[i].images.fixed_width_small.url  (a small GIF; or ...fixed_width_small.mp4)</w:t>
-      </w:r>
-      <w:r>
-        <w:br/>
-      </w:r>
-      <w:r>
-        <w:rPr>
-          <w:rStyle w:val="CommentTok"/>
-        </w:rPr>
-        <w:t xml:space="preserve">// send this:            data[i].images.fixed_height.mp4        (a small MP4, usually well under 1 MB)</w:t>
-      </w:r>
-      <w:r>
-        <w:br/>
-      </w:r>
-      <w:r>
-        <w:rPr>
-          <w:rStyle w:val="ControlFlowTok"/>
-        </w:rPr>
-        <w:t xml:space="preserve">await</w:t>
-      </w:r>
-      <w:r>
-        <w:rPr>
-          <w:rStyle w:val="NormalTok"/>
-        </w:rPr>
-        <w:t xml:space="preserve"> chat</w:t>
-      </w:r>
-      <w:r>
-        <w:rPr>
-          <w:rStyle w:val="OperatorTok"/>
-        </w:rPr>
-        <w:t xml:space="preserve">.</w:t>
-      </w:r>
-      <w:r>
-        <w:rPr>
-          <w:rStyle w:val="FunctionTok"/>
-        </w:rPr>
-        <w:t xml:space="preserve">sendGif</w:t>
-      </w:r>
-      <w:r>
-        <w:rPr>
-          <w:rStyle w:val="NormalTok"/>
-        </w:rPr>
-        <w:t xml:space="preserve">({ url</w:t>
-      </w:r>
-      <w:r>
-        <w:rPr>
-          <w:rStyle w:val="OperatorTok"/>
-        </w:rPr>
-        <w:t xml:space="preserve">:</w:t>
-      </w:r>
-      <w:r>
-        <w:rPr>
-          <w:rStyle w:val="NormalTok"/>
-        </w:rPr>
-        <w:t xml:space="preserve"> data[i]</w:t>
-      </w:r>
-      <w:r>
-        <w:rPr>
-          <w:rStyle w:val="OperatorTok"/>
-        </w:rPr>
-        <w:t xml:space="preserve">.</w:t>
-      </w:r>
-      <w:r>
-        <w:rPr>
-          <w:rStyle w:val="AttributeTok"/>
-        </w:rPr>
-        <w:t xml:space="preserve">images</w:t>
-      </w:r>
-      <w:r>
-        <w:rPr>
-          <w:rStyle w:val="OperatorTok"/>
-        </w:rPr>
-        <w:t xml:space="preserve">.</w:t>
-      </w:r>
-      <w:r>
-        <w:rPr>
-          <w:rStyle w:val="AttributeTok"/>
-        </w:rPr>
-        <w:t xml:space="preserve">fixed_height</w:t>
-      </w:r>
-      <w:r>
-        <w:rPr>
-          <w:rStyle w:val="OperatorTok"/>
-        </w:rPr>
-        <w:t xml:space="preserve">.</w:t>
-      </w:r>
-      <w:r>
-        <w:rPr>
-          <w:rStyle w:val="AttributeTok"/>
-        </w:rPr>
-        <w:t xml:space="preserve">mp4</w:t>
-      </w:r>
-      <w:r>
-        <w:rPr>
-          <w:rStyle w:val="NormalTok"/>
-        </w:rPr>
-        <w:t xml:space="preserve"> })</w:t>
-      </w:r>
-    </w:p>
-    <w:p>
-      <w:pPr>
-        <w:pStyle w:val="FirstParagraph"/>
-      </w:pPr>
-      <w:r>
-        <w:t xml:space="preserve">Use</w:t>
+        <w:t xml:space="preserve">chat.sendGif</w:t>
+      </w:r>
+      <w:r>
+        <w:t xml:space="preserve">) and refuses</w:t>
       </w:r>
       <w:r>
         <w:t xml:space="preserve"> </w:t>
@@ -13333,103 +12681,31 @@
         <w:rPr>
           <w:rStyle w:val="VerbatimChar"/>
         </w:rPr>
-        <w:t xml:space="preserve">rating=pg</w:t>
-      </w:r>
-      <w:r>
-        <w:t xml:space="preserve"> </w:t>
-      </w:r>
-      <w:r>
-        <w:t xml:space="preserve">(or stricter) because this is a customer-care chat. Choose a</w:t>
-      </w:r>
-      <w:r>
-        <w:t xml:space="preserve"> </w:t>
-      </w:r>
-      <w:r>
-        <w:rPr>
-          <w:b/>
-          <w:bCs/>
-        </w:rPr>
-        <w:t xml:space="preserve">small rendition</w:t>
-      </w:r>
-      <w:r>
-        <w:t xml:space="preserve"> </w:t>
-      </w:r>
-      <w:r>
-        <w:t xml:space="preserve">(a few hundred KB): the limit is 16 MB</w:t>
-      </w:r>
-      <w:r>
-        <w:t xml:space="preserve"> </w:t>
-      </w:r>
-      <w:r>
-        <w:t xml:space="preserve">but a GIF should send in a second. If the GIF host is blocked by the app’s Content Security Policy or network settings, allow the</w:t>
-      </w:r>
-      <w:r>
-        <w:t xml:space="preserve"> </w:t>
-      </w:r>
-      <w:r>
-        <w:t xml:space="preserve">provider’s media domain (</w:t>
+        <w:t xml:space="preserve">.gif</w:t>
+      </w:r>
+      <w:r>
+        <w:t xml:space="preserve"> </w:t>
+      </w:r>
+      <w:r>
+        <w:t xml:space="preserve">files with the error</w:t>
+      </w:r>
+      <w:r>
+        <w:t xml:space="preserve"> </w:t>
       </w:r>
       <w:r>
         <w:rPr>
           <w:rStyle w:val="VerbatimChar"/>
         </w:rPr>
-        <w:t xml:space="preserve">*.giphy.com</w:t>
-      </w:r>
-      <w:r>
-        <w:t xml:space="preserve">) for</w:t>
-      </w:r>
-      <w:r>
-        <w:t xml:space="preserve"> </w:t>
-      </w:r>
-      <w:r>
-        <w:rPr>
-          <w:rStyle w:val="VerbatimChar"/>
-        </w:rPr>
-        <w:t xml:space="preserve">connect-src</w:t>
-      </w:r>
-      <w:r>
-        <w:t xml:space="preserve">,</w:t>
-      </w:r>
-      <w:r>
-        <w:t xml:space="preserve"> </w:t>
-      </w:r>
-      <w:r>
-        <w:rPr>
-          <w:rStyle w:val="VerbatimChar"/>
-        </w:rPr>
-        <w:t xml:space="preserve">img-src</w:t>
-      </w:r>
-      <w:r>
-        <w:t xml:space="preserve"> </w:t>
-      </w:r>
-      <w:r>
-        <w:t xml:space="preserve">and</w:t>
-      </w:r>
-      <w:r>
-        <w:t xml:space="preserve"> </w:t>
-      </w:r>
-      <w:r>
-        <w:rPr>
-          <w:rStyle w:val="VerbatimChar"/>
-        </w:rPr>
-        <w:t xml:space="preserve">media-src</w:t>
-      </w:r>
-      <w:r>
-        <w:t xml:space="preserve">.</w:t>
-      </w:r>
-    </w:p>
-    <w:p>
-      <w:pPr>
-        <w:pStyle w:val="BodyText"/>
-      </w:pPr>
-      <w:r>
-        <w:t xml:space="preserve">The sender sees the GIF at once with a local preview (</w:t>
-      </w:r>
-      <w:r>
-        <w:t xml:space="preserve">“sending”</w:t>
-      </w:r>
-      <w:r>
-        <w:t xml:space="preserve">), then the ticks, like any message.</w:t>
+        <w:t xml:space="preserve">gif_must_be_mp4</w:t>
+      </w:r>
+      <w:r>
+        <w:t xml:space="preserve">. The app does not need</w:t>
+      </w:r>
+      <w:r>
+        <w:t xml:space="preserve"> </w:t>
+      </w:r>
+      <w:r>
+        <w:t xml:space="preserve">either: do not build a GIF button.</w:t>
       </w:r>
     </w:p>
     <w:bookmarkEnd w:id="34"/>
@@ -14434,74 +13710,6 @@
               <w:rPr>
                 <w:rStyle w:val="VerbatimChar"/>
               </w:rPr>
-              <w:t xml:space="preserve">gif_must_be_mp4</w:t>
-            </w:r>
-          </w:p>
-        </w:tc>
-        <w:tc>
-          <w:tcPr/>
-          <w:p>
-            <w:pPr>
-              <w:pStyle w:val="Compact"/>
-            </w:pPr>
-            <w:r>
-              <w:t xml:space="preserve">A</w:t>
-            </w:r>
-            <w:r>
-              <w:t xml:space="preserve"> </w:t>
-            </w:r>
-            <w:r>
-              <w:rPr>
-                <w:rStyle w:val="VerbatimChar"/>
-              </w:rPr>
-              <w:t xml:space="preserve">.gif</w:t>
-            </w:r>
-            <w:r>
-              <w:t xml:space="preserve"> </w:t>
-            </w:r>
-            <w:r>
-              <w:t xml:space="preserve">file was given</w:t>
-            </w:r>
-          </w:p>
-        </w:tc>
-        <w:tc>
-          <w:tcPr/>
-          <w:p>
-            <w:pPr>
-              <w:pStyle w:val="Compact"/>
-            </w:pPr>
-            <w:r>
-              <w:t xml:space="preserve">Use the GIF picker; hide</w:t>
-            </w:r>
-            <w:r>
-              <w:t xml:space="preserve"> </w:t>
-            </w:r>
-            <w:r>
-              <w:rPr>
-                <w:rStyle w:val="VerbatimChar"/>
-              </w:rPr>
-              <w:t xml:space="preserve">.gif</w:t>
-            </w:r>
-            <w:r>
-              <w:t xml:space="preserve"> </w:t>
-            </w:r>
-            <w:r>
-              <w:t xml:space="preserve">in the gallery</w:t>
-            </w:r>
-          </w:p>
-        </w:tc>
-      </w:tr>
-      <w:tr>
-        <w:tc>
-          <w:tcPr/>
-          <w:p>
-            <w:pPr>
-              <w:pStyle w:val="Compact"/>
-            </w:pPr>
-            <w:r>
-              <w:rPr>
-                <w:rStyle w:val="VerbatimChar"/>
-              </w:rPr>
               <w:t xml:space="preserve">bad_request</w:t>
             </w:r>
           </w:p>
@@ -15661,7 +14869,7 @@
               <w:t xml:space="preserve"> </w:t>
             </w:r>
             <w:r>
-              <w:t xml:space="preserve">for the same host (files are served from it) and the GIF provider</w:t>
+              <w:t xml:space="preserve">for the same host (files are served from it)</w:t>
             </w:r>
           </w:p>
         </w:tc>
@@ -15956,7 +15164,7 @@
         <w:t xml:space="preserve"> </w:t>
       </w:r>
       <w:r>
-        <w:t xml:space="preserve">button (Document, Photos &amp; videos, Camera, Audio, GIF).</w:t>
+        <w:t xml:space="preserve">button (Document, Photos &amp; videos, Camera, Audio).</w:t>
       </w:r>
     </w:p>
     <w:p>
@@ -15968,25 +15176,41 @@
         </w:numPr>
       </w:pPr>
       <w:r>
-        <w:t xml:space="preserve">The GIF panel: the sample buttons make a looping MP4 in the browser and send it, so you can see a GIF arrive without any service</w:t>
-      </w:r>
-      <w:r>
-        <w:t xml:space="preserve"> </w:t>
-      </w:r>
-      <w:r>
-        <w:t xml:space="preserve">(paste a GIPHY key under</w:t>
-      </w:r>
-      <w:r>
-        <w:t xml:space="preserve"> </w:t>
-      </w:r>
-      <w:r>
-        <w:t xml:space="preserve">“GIPHY key”</w:t>
-      </w:r>
-      <w:r>
-        <w:t xml:space="preserve"> </w:t>
-      </w:r>
-      <w:r>
-        <w:t xml:space="preserve">to try real search).</w:t>
+        <w:t xml:space="preserve">The</w:t>
+      </w:r>
+      <w:r>
+        <w:t xml:space="preserve"> </w:t>
+      </w:r>
+      <w:r>
+        <w:rPr>
+          <w:b/>
+          <w:bCs/>
+        </w:rPr>
+        <w:t xml:space="preserve">GIF</w:t>
+      </w:r>
+      <w:r>
+        <w:t xml:space="preserve"> </w:t>
+      </w:r>
+      <w:r>
+        <w:t xml:space="preserve">button on the Agent tab: it makes a looping MP4 in the browser and sends it as the agent, so you can see a GIF arrive</w:t>
+      </w:r>
+      <w:r>
+        <w:t xml:space="preserve"> </w:t>
+      </w:r>
+      <w:r>
+        <w:t xml:space="preserve">on the phone (a muted loop with a</w:t>
+      </w:r>
+      <w:r>
+        <w:t xml:space="preserve"> </w:t>
+      </w:r>
+      <w:r>
+        <w:t xml:space="preserve">“GIF”</w:t>
+      </w:r>
+      <w:r>
+        <w:t xml:space="preserve"> </w:t>
+      </w:r>
+      <w:r>
+        <w:t xml:space="preserve">tag).</w:t>
       </w:r>
     </w:p>
     <w:p>
@@ -16416,30 +15640,18 @@
               <w:pStyle w:val="Compact"/>
             </w:pPr>
             <w:r>
-              <w:t xml:space="preserve">GIF from the picker; GIF from the gallery (</w:t>
-            </w:r>
-            <w:r>
-              <w:rPr>
-                <w:rStyle w:val="VerbatimChar"/>
-              </w:rPr>
-              <w:t xml:space="preserve">.gif</w:t>
-            </w:r>
-            <w:r>
-              <w:t xml:space="preserve"> </w:t>
-            </w:r>
-            <w:r>
-              <w:t xml:space="preserve">file)</w:t>
-            </w:r>
-          </w:p>
-        </w:tc>
-        <w:tc>
-          <w:tcPr/>
-          <w:p>
-            <w:pPr>
-              <w:pStyle w:val="Compact"/>
-            </w:pPr>
-            <w:r>
-              <w:t xml:space="preserve">First plays as a loop in the app and in Halo; second is refused with a clear message</w:t>
+              <w:t xml:space="preserve">A GIF arrives (the simulator’s Agent tab, later from Halo)</w:t>
+            </w:r>
+          </w:p>
+        </w:tc>
+        <w:tc>
+          <w:tcPr/>
+          <w:p>
+            <w:pPr>
+              <w:pStyle w:val="Compact"/>
+            </w:pPr>
+            <w:r>
+              <w:t xml:space="preserve">Plays by itself as a muted loop with a GIF tag, no controls, on iPhone and Android</w:t>
             </w:r>
           </w:p>
         </w:tc>
@@ -17207,29 +16419,29 @@
               <w:pStyle w:val="Compact"/>
             </w:pPr>
             <w:r>
-              <w:t xml:space="preserve">GIF picker and GIF display</w:t>
-            </w:r>
-          </w:p>
-        </w:tc>
-        <w:tc>
-          <w:tcPr/>
-          <w:p>
-            <w:pPr>
-              <w:pStyle w:val="Compact"/>
-            </w:pPr>
-            <w:r>
-              <w:t xml:space="preserve">10 (needs the provider key)</w:t>
-            </w:r>
-          </w:p>
-        </w:tc>
-        <w:tc>
-          <w:tcPr/>
-          <w:p>
-            <w:pPr>
-              <w:pStyle w:val="Compact"/>
-            </w:pPr>
-            <w:r>
-              <w:t xml:space="preserve">2</w:t>
+              <w:t xml:space="preserve">GIF display (a looping, muted, controls-free video)</w:t>
+            </w:r>
+          </w:p>
+        </w:tc>
+        <w:tc>
+          <w:tcPr/>
+          <w:p>
+            <w:pPr>
+              <w:pStyle w:val="Compact"/>
+            </w:pPr>
+            <w:r>
+              <w:t xml:space="preserve">10</w:t>
+            </w:r>
+          </w:p>
+        </w:tc>
+        <w:tc>
+          <w:tcPr/>
+          <w:p>
+            <w:pPr>
+              <w:pStyle w:val="Compact"/>
+            </w:pPr>
+            <w:r>
+              <w:t xml:space="preserve">0.5</w:t>
             </w:r>
           </w:p>
         </w:tc>
@@ -17505,7 +16717,7 @@
               <w:t xml:space="preserve">3 to 4 weeks</w:t>
             </w:r>
             <w:r>
-              <w:t xml:space="preserve">, with the backend endpoint and the GIF key ready on day one</w:t>
+              <w:t xml:space="preserve">, with the backend endpoint ready on day one</w:t>
             </w:r>
           </w:p>
         </w:tc>
@@ -17520,7 +16732,7 @@
                 <w:b/>
                 <w:bCs/>
               </w:rPr>
-              <w:t xml:space="preserve">about 29</w:t>
+              <w:t xml:space="preserve">about 27</w:t>
             </w:r>
           </w:p>
         </w:tc>
@@ -17738,29 +16950,29 @@
               <w:pStyle w:val="Compact"/>
             </w:pPr>
             <w:r>
-              <w:t xml:space="preserve">GIF provider account and key (GIPHY recommended), attribution decision, whether the backend proxies it</w:t>
-            </w:r>
-          </w:p>
-        </w:tc>
-        <w:tc>
-          <w:tcPr/>
-          <w:p>
-            <w:pPr>
-              <w:pStyle w:val="Compact"/>
-            </w:pPr>
-            <w:r>
-              <w:t xml:space="preserve">Product and security</w:t>
-            </w:r>
-          </w:p>
-        </w:tc>
-        <w:tc>
-          <w:tcPr/>
-          <w:p>
-            <w:pPr>
-              <w:pStyle w:val="Compact"/>
-            </w:pPr>
-            <w:r>
-              <w:t xml:space="preserve">Task 8</w:t>
+              <w:t xml:space="preserve">Decision: should Halo agents be able to post GIFs? (section 10.2)</w:t>
+            </w:r>
+          </w:p>
+        </w:tc>
+        <w:tc>
+          <w:tcPr/>
+          <w:p>
+            <w:pPr>
+              <w:pStyle w:val="Compact"/>
+            </w:pPr>
+            <w:r>
+              <w:t xml:space="preserve">Product</w:t>
+            </w:r>
+          </w:p>
+        </w:tc>
+        <w:tc>
+          <w:tcPr/>
+          <w:p>
+            <w:pPr>
+              <w:pStyle w:val="Compact"/>
+            </w:pPr>
+            <w:r>
+              <w:t xml:space="preserve">Not blocking: the app shows one either way</w:t>
             </w:r>
           </w:p>
         </w:tc>
@@ -18413,34 +17625,7 @@
     <w:abstractNumId w:val="991"/>
   </w:num>
   <w:num w:numId="1007">
-    <w:abstractNumId w:val="99411"/>
-    <w:lvlOverride w:ilvl="0">
-      <w:startOverride w:val="1"/>
-    </w:lvlOverride>
-    <w:lvlOverride w:ilvl="1">
-      <w:startOverride w:val="1"/>
-    </w:lvlOverride>
-    <w:lvlOverride w:ilvl="2">
-      <w:startOverride w:val="1"/>
-    </w:lvlOverride>
-    <w:lvlOverride w:ilvl="3">
-      <w:startOverride w:val="1"/>
-    </w:lvlOverride>
-    <w:lvlOverride w:ilvl="4">
-      <w:startOverride w:val="1"/>
-    </w:lvlOverride>
-    <w:lvlOverride w:ilvl="5">
-      <w:startOverride w:val="1"/>
-    </w:lvlOverride>
-    <w:lvlOverride w:ilvl="6">
-      <w:startOverride w:val="1"/>
-    </w:lvlOverride>
-    <w:lvlOverride w:ilvl="7">
-      <w:startOverride w:val="1"/>
-    </w:lvlOverride>
-    <w:lvlOverride w:ilvl="8">
-      <w:startOverride w:val="1"/>
-    </w:lvlOverride>
+    <w:abstractNumId w:val="991"/>
   </w:num>
   <w:num w:numId="1008">
     <w:abstractNumId w:val="991"/>

</xml_diff>

<commit_message>
Vircle Chat: build specification for the app engineer's coding agent; scripted support agent for the simulator
docs/vircle-chat-app-build-spec.md: rules of work, architecture (framework-free
engine behind ports), engine API, numbered requirements, SQLite schema, algorithms,
error and i18n tables, tasks T00-T22 with acceptance criteria, testing, hand-in
checklist. Its code and SQL were type-checked and run.

History design simplified: the app engine owns paging, the phone's copy, the
cleared-before marker and Clear chat; library 1.1.0 only adds fetchHistory
(gateway work package 9 now about 7.5 days). Design document corrected: the
library does not stop on a 401 from getSession, the engine must.

gateway/scripts/sim-agent.mjs plays Halo's support agent against the local
simulator; sim-agent-selftest.mjs checks it with the real library. The app kit
script includes the spec and these helpers.

Co-Authored-By: Claude Sonnet 5.5 <noreply@anthropic.com>
</commit_message>
<xml_diff>
--- a/docs/vircle-chat-app-design.docx
+++ b/docs/vircle-chat-app-design.docx
@@ -151,6 +151,48 @@
       </w:r>
       <w:r>
         <w:t xml:space="preserve">notification.</w:t>
+      </w:r>
+    </w:p>
+    <w:p>
+      <w:pPr>
+        <w:pStyle w:val="BodyText"/>
+      </w:pPr>
+      <w:r>
+        <w:rPr>
+          <w:b/>
+          <w:bCs/>
+        </w:rPr>
+        <w:t xml:space="preserve">For the engineer’s coding agent.</w:t>
+      </w:r>
+      <w:r>
+        <w:t xml:space="preserve"> </w:t>
+      </w:r>
+      <w:r>
+        <w:t xml:space="preserve">The step-by-step build specification (architecture, interfaces, algorithms, a task order with</w:t>
+      </w:r>
+      <w:r>
+        <w:t xml:space="preserve"> </w:t>
+      </w:r>
+      <w:r>
+        <w:t xml:space="preserve">acceptance criteria, and how to test against a local gateway with a scripted support agent) is</w:t>
+      </w:r>
+      <w:r>
+        <w:t xml:space="preserve"> </w:t>
+      </w:r>
+      <w:r>
+        <w:rPr>
+          <w:rStyle w:val="VerbatimChar"/>
+        </w:rPr>
+        <w:t xml:space="preserve">vircle-chat-app-build-spec.md</w:t>
+      </w:r>
+      <w:r>
+        <w:t xml:space="preserve">, in the</w:t>
+      </w:r>
+      <w:r>
+        <w:t xml:space="preserve"> </w:t>
+      </w:r>
+      <w:r>
+        <w:t xml:space="preserve">kit. This document says what and why; that one says how.</w:t>
       </w:r>
     </w:p>
     <w:p>
@@ -418,7 +460,22 @@
               <w:t xml:space="preserve"> </w:t>
             </w:r>
             <w:r>
-              <w:t xml:space="preserve">Halo endpoint, gateway frame and library 1.1.0 (section 7.7, gateway work package 9)</w:t>
+              <w:t xml:space="preserve">Halo endpoint, gateway frame and one new library call,</w:t>
+            </w:r>
+            <w:r>
+              <w:t xml:space="preserve"> </w:t>
+            </w:r>
+            <w:r>
+              <w:rPr>
+                <w:rStyle w:val="VerbatimChar"/>
+              </w:rPr>
+              <w:t xml:space="preserve">fetchHistory</w:t>
+            </w:r>
+            <w:r>
+              <w:t xml:space="preserve"> </w:t>
+            </w:r>
+            <w:r>
+              <w:t xml:space="preserve">(library 1.1.0). The app’s own engine does the paging, the copy on the phone and Clear chat (section 7.7, build specification, gateway work package 9)</w:t>
             </w:r>
           </w:p>
         </w:tc>
@@ -1747,10 +1804,10 @@
               <w:rPr>
                 <w:rStyle w:val="VerbatimChar"/>
               </w:rPr>
-              <w:t xml:space="preserve">loadOlder</w:t>
-            </w:r>
-            <w:r>
-              <w:t xml:space="preserve">; you draw the loading row (section 7.7)</w:t>
+              <w:t xml:space="preserve">fetchHistory</w:t>
+            </w:r>
+            <w:r>
+              <w:t xml:space="preserve">; your engine pages and keeps them; you draw the loading row (section 7.7)</w:t>
             </w:r>
           </w:p>
         </w:tc>
@@ -1811,7 +1868,7 @@
               <w:pStyle w:val="Compact"/>
             </w:pPr>
             <w:r>
-              <w:t xml:space="preserve">Library</w:t>
+              <w:t xml:space="preserve">Your engine’s</w:t>
             </w:r>
             <w:r>
               <w:t xml:space="preserve"> </w:t>
@@ -1820,7 +1877,7 @@
               <w:rPr>
                 <w:rStyle w:val="VerbatimChar"/>
               </w:rPr>
-              <w:t xml:space="preserve">clearChat</w:t>
+              <w:t xml:space="preserve">clearChat()</w:t>
             </w:r>
             <w:r>
               <w:t xml:space="preserve">; you add the menu item (section 7.7)</w:t>
@@ -5042,7 +5099,7 @@
         </w:numPr>
       </w:pPr>
       <w:r>
-        <w:t xml:space="preserve">Answer 401 when nobody is signed in; the library then stops trying and reports</w:t>
+        <w:t xml:space="preserve">Answer 401 when nobody is signed in. The library cannot tell a 401 from a network failure: it reports</w:t>
       </w:r>
       <w:r>
         <w:t xml:space="preserve"> </w:t>
@@ -5054,7 +5111,41 @@
         <w:t xml:space="preserve">lastError</w:t>
       </w:r>
       <w:r>
-        <w:t xml:space="preserve">.</w:t>
+        <w:t xml:space="preserve"> </w:t>
+      </w:r>
+      <w:r>
+        <w:t xml:space="preserve">(</w:t>
+      </w:r>
+      <w:r>
+        <w:rPr>
+          <w:rStyle w:val="VerbatimChar"/>
+        </w:rPr>
+        <w:t xml:space="preserve">session_failed</w:t>
+      </w:r>
+      <w:r>
+        <w:t xml:space="preserve">) and keeps</w:t>
+      </w:r>
+      <w:r>
+        <w:t xml:space="preserve"> </w:t>
+      </w:r>
+      <w:r>
+        <w:t xml:space="preserve">retrying with growing waits, so</w:t>
+      </w:r>
+      <w:r>
+        <w:t xml:space="preserve"> </w:t>
+      </w:r>
+      <w:r>
+        <w:rPr>
+          <w:b/>
+          <w:bCs/>
+        </w:rPr>
+        <w:t xml:space="preserve">the app’s engine stops it</w:t>
+      </w:r>
+      <w:r>
+        <w:t xml:space="preserve"> </w:t>
+      </w:r>
+      <w:r>
+        <w:t xml:space="preserve">on a 401 (build specification).</w:t>
       </w:r>
     </w:p>
     <w:p>
@@ -9987,19 +10078,7 @@
         <w:t xml:space="preserve"> </w:t>
       </w:r>
       <w:r>
-        <w:t xml:space="preserve">and has no</w:t>
-      </w:r>
-      <w:r>
-        <w:t xml:space="preserve"> </w:t>
-      </w:r>
-      <w:r>
-        <w:rPr>
-          <w:rStyle w:val="VerbatimChar"/>
-        </w:rPr>
-        <w:t xml:space="preserve">loadOlder</w:t>
-      </w:r>
-      <w:r>
-        <w:t xml:space="preserve">. This section describes library</w:t>
+        <w:t xml:space="preserve">and cannot fetch older ones.</w:t>
       </w:r>
       <w:r>
         <w:t xml:space="preserve"> </w:t>
@@ -10009,22 +10088,68 @@
           <w:b/>
           <w:bCs/>
         </w:rPr>
-        <w:t xml:space="preserve">1.1.0</w:t>
-      </w:r>
-      <w:r>
-        <w:t xml:space="preserve">, which arrives with the Halo and gateway pieces (protocol section 7,</w:t>
-      </w:r>
-      <w:r>
-        <w:t xml:space="preserve"> </w:t>
-      </w:r>
-      <w:r>
-        <w:t xml:space="preserve">contract section 3.5, gateway work package 9). Build the rest of the screen now; the items here plug in later without changes</w:t>
-      </w:r>
-      <w:r>
-        <w:t xml:space="preserve"> </w:t>
-      </w:r>
-      <w:r>
-        <w:t xml:space="preserve">elsewhere.</w:t>
+        <w:t xml:space="preserve">Library 1.1.0 adds one call,</w:t>
+      </w:r>
+      <w:r>
+        <w:rPr>
+          <w:b/>
+          <w:bCs/>
+        </w:rPr>
+        <w:t xml:space="preserve"> </w:t>
+      </w:r>
+      <w:r>
+        <w:rPr>
+          <w:rStyle w:val="VerbatimChar"/>
+          <w:b/>
+          <w:bCs/>
+        </w:rPr>
+        <w:t xml:space="preserve">fetchHistory</w:t>
+      </w:r>
+      <w:r>
+        <w:t xml:space="preserve">, which returns one page of older messages from Halo and nothing</w:t>
+      </w:r>
+      <w:r>
+        <w:t xml:space="preserve"> </w:t>
+      </w:r>
+      <w:r>
+        <w:t xml:space="preserve">else (protocol section 7, contract section 3.5, gateway work package 9).</w:t>
+      </w:r>
+      <w:r>
+        <w:t xml:space="preserve"> </w:t>
+      </w:r>
+      <w:r>
+        <w:rPr>
+          <w:b/>
+          <w:bCs/>
+        </w:rPr>
+        <w:t xml:space="preserve">Everything else in this section is the app’s own engine</w:t>
+      </w:r>
+      <w:r>
+        <w:t xml:space="preserve"> </w:t>
+      </w:r>
+      <w:r>
+        <w:t xml:space="preserve">(</w:t>
+      </w:r>
+      <w:r>
+        <w:rPr>
+          <w:rStyle w:val="VerbatimChar"/>
+        </w:rPr>
+        <w:t xml:space="preserve">docs/vircle-chat-app-build-spec.md</w:t>
+      </w:r>
+      <w:r>
+        <w:t xml:space="preserve">): paging, the copy on the phone, the cleared-before marker, Clear chat. The engine’s copy already</w:t>
+      </w:r>
+      <w:r>
+        <w:t xml:space="preserve"> </w:t>
+      </w:r>
+      <w:r>
+        <w:t xml:space="preserve">keeps, until Clear chat, every message the library delivers, so most of this works before 1.1.0 exists; only reaching past what the phone</w:t>
+      </w:r>
+      <w:r>
+        <w:t xml:space="preserve"> </w:t>
+      </w:r>
+      <w:r>
+        <w:t xml:space="preserve">holds waits for the server work.</w:t>
       </w:r>
     </w:p>
     <w:p>
@@ -10147,7 +10272,7 @@
         </w:numPr>
       </w:pPr>
       <w:r>
-        <w:t xml:space="preserve">As the user scrolls up and gets near the top (about one and a half screens away), the screen asks for the next older page with</w:t>
+        <w:t xml:space="preserve">As the user scrolls up and gets near the top (about one and a half screens away), the screen asks the engine for the next older page with</w:t>
       </w:r>
       <w:r>
         <w:t xml:space="preserve"> </w:t>
@@ -10156,10 +10281,25 @@
         <w:rPr>
           <w:rStyle w:val="VerbatimChar"/>
         </w:rPr>
-        <w:t xml:space="preserve">chat.loadOlder()</w:t>
-      </w:r>
-      <w:r>
-        <w:t xml:space="preserve">:</w:t>
+        <w:t xml:space="preserve">engine.loadOlder()</w:t>
+      </w:r>
+      <w:r>
+        <w:t xml:space="preserve"> </w:t>
+      </w:r>
+      <w:r>
+        <w:t xml:space="preserve">(its own copy first, then Halo through</w:t>
+      </w:r>
+      <w:r>
+        <w:t xml:space="preserve"> </w:t>
+      </w:r>
+      <w:r>
+        <w:rPr>
+          <w:rStyle w:val="VerbatimChar"/>
+        </w:rPr>
+        <w:t xml:space="preserve">fetchHistory</w:t>
+      </w:r>
+      <w:r>
+        <w:t xml:space="preserve">):</w:t>
       </w:r>
       <w:r>
         <w:t xml:space="preserve"> </w:t>
@@ -10267,13 +10407,28 @@
         <w:rPr>
           <w:rStyle w:val="VerbatimChar"/>
         </w:rPr>
-        <w:t xml:space="preserve">loadingOlder</w:t>
-      </w:r>
-      <w:r>
-        <w:t xml:space="preserve"> </w:t>
-      </w:r>
-      <w:r>
-        <w:t xml:space="preserve">is true while one is out).</w:t>
+        <w:t xml:space="preserve">history.phase</w:t>
+      </w:r>
+      <w:r>
+        <w:t xml:space="preserve"> </w:t>
+      </w:r>
+      <w:r>
+        <w:t xml:space="preserve">is</w:t>
+      </w:r>
+      <w:r>
+        <w:t xml:space="preserve"> </w:t>
+      </w:r>
+      <w:r>
+        <w:rPr>
+          <w:rStyle w:val="VerbatimChar"/>
+        </w:rPr>
+        <w:t xml:space="preserve">loading</w:t>
+      </w:r>
+      <w:r>
+        <w:t xml:space="preserve"> </w:t>
+      </w:r>
+      <w:r>
+        <w:t xml:space="preserve">while one is out).</w:t>
       </w:r>
     </w:p>
     <w:p>
@@ -10294,7 +10449,7 @@
         <w:rPr>
           <w:rStyle w:val="VerbatimChar"/>
         </w:rPr>
-        <w:t xml:space="preserve">historyEnd</w:t>
+        <w:t xml:space="preserve">history.end</w:t>
       </w:r>
       <w:r>
         <w:t xml:space="preserve"> </w:t>
@@ -10378,7 +10533,22 @@
         <w:rPr>
           <w:rStyle w:val="VerbatimChar"/>
         </w:rPr>
-        <w:t xml:space="preserve">historyError</w:t>
+        <w:t xml:space="preserve">history.phase</w:t>
+      </w:r>
+      <w:r>
+        <w:t xml:space="preserve"> </w:t>
+      </w:r>
+      <w:r>
+        <w:t xml:space="preserve">is</w:t>
+      </w:r>
+      <w:r>
+        <w:t xml:space="preserve"> </w:t>
+      </w:r>
+      <w:r>
+        <w:rPr>
+          <w:rStyle w:val="VerbatimChar"/>
+        </w:rPr>
+        <w:t xml:space="preserve">error</w:t>
       </w:r>
       <w:r>
         <w:t xml:space="preserve">: Halo or the network is down) show a row</w:t>
@@ -10408,7 +10578,7 @@
         <w:rPr>
           <w:rStyle w:val="VerbatimChar"/>
         </w:rPr>
-        <w:t xml:space="preserve">loadOlder()</w:t>
+        <w:t xml:space="preserve">engine.loadOlder()</w:t>
       </w:r>
       <w:r>
         <w:t xml:space="preserve"> </w:t>
@@ -10810,13 +10980,13 @@
         <w:rPr>
           <w:rStyle w:val="VerbatimChar"/>
         </w:rPr>
-        <w:t xml:space="preserve">await chat.clearChat()</w:t>
-      </w:r>
-      <w:r>
-        <w:t xml:space="preserve"> </w:t>
-      </w:r>
-      <w:r>
-        <w:t xml:space="preserve">removes every cached message; the app deletes its saved files. The library keeps a</w:t>
+        <w:t xml:space="preserve">await engine.clearChat()</w:t>
+      </w:r>
+      <w:r>
+        <w:t xml:space="preserve"> </w:t>
+      </w:r>
+      <w:r>
+        <w:t xml:space="preserve">removes every cached message and the app deletes its saved files. The engine keeps a</w:t>
       </w:r>
       <w:r>
         <w:t xml:space="preserve"> </w:t>
@@ -10846,22 +11016,13 @@
         <w:t xml:space="preserve"> </w:t>
       </w:r>
       <w:r>
-        <w:t xml:space="preserve">(the gateway’s time at that moment):</w:t>
-      </w:r>
-      <w:r>
-        <w:t xml:space="preserve"> </w:t>
-      </w:r>
-      <w:r>
-        <w:rPr>
-          <w:rStyle w:val="VerbatimChar"/>
-        </w:rPr>
-        <w:t xml:space="preserve">loadOlder()</w:t>
-      </w:r>
-      <w:r>
-        <w:t xml:space="preserve"> </w:t>
-      </w:r>
-      <w:r>
-        <w:t xml:space="preserve">never goes past it, so cleared history does not come back by scrolling.</w:t>
+        <w:t xml:space="preserve">(the time of the newest message it held): older messages are neither shown nor fetched again, so cleared history does not</w:t>
+      </w:r>
+      <w:r>
+        <w:t xml:space="preserve"> </w:t>
+      </w:r>
+      <w:r>
+        <w:t xml:space="preserve">come back by scrolling.</w:t>
       </w:r>
       <w:r>
         <w:t xml:space="preserve"> </w:t>
@@ -11085,7 +11246,7 @@
           <w:b/>
           <w:bCs/>
         </w:rPr>
-        <w:t xml:space="preserve">Snapshot additions in 1.1.0:</w:t>
+        <w:t xml:space="preserve">Engine state for the screen:</w:t>
       </w:r>
       <w:r>
         <w:t xml:space="preserve"> </w:t>
@@ -11094,7 +11255,19 @@
         <w:rPr>
           <w:rStyle w:val="VerbatimChar"/>
         </w:rPr>
-        <w:t xml:space="preserve">hasOlder</w:t>
+        <w:t xml:space="preserve">history.phase</w:t>
+      </w:r>
+      <w:r>
+        <w:t xml:space="preserve"> </w:t>
+      </w:r>
+      <w:r>
+        <w:t xml:space="preserve">(</w:t>
+      </w:r>
+      <w:r>
+        <w:rPr>
+          <w:rStyle w:val="VerbatimChar"/>
+        </w:rPr>
+        <w:t xml:space="preserve">idle</w:t>
       </w:r>
       <w:r>
         <w:t xml:space="preserve">,</w:t>
@@ -11106,7 +11279,7 @@
         <w:rPr>
           <w:rStyle w:val="VerbatimChar"/>
         </w:rPr>
-        <w:t xml:space="preserve">loadingOlder</w:t>
+        <w:t xml:space="preserve">loading</w:t>
       </w:r>
       <w:r>
         <w:t xml:space="preserve">,</w:t>
@@ -11118,7 +11291,19 @@
         <w:rPr>
           <w:rStyle w:val="VerbatimChar"/>
         </w:rPr>
-        <w:t xml:space="preserve">historyEnd</w:t>
+        <w:t xml:space="preserve">error</w:t>
+      </w:r>
+      <w:r>
+        <w:t xml:space="preserve">),</w:t>
+      </w:r>
+      <w:r>
+        <w:t xml:space="preserve"> </w:t>
+      </w:r>
+      <w:r>
+        <w:rPr>
+          <w:rStyle w:val="VerbatimChar"/>
+        </w:rPr>
+        <w:t xml:space="preserve">history.end</w:t>
       </w:r>
       <w:r>
         <w:t xml:space="preserve"> </w:t>
@@ -11169,7 +11354,7 @@
         <w:t xml:space="preserve">'cleared'</w:t>
       </w:r>
       <w:r>
-        <w:t xml:space="preserve">),</w:t>
+        <w:t xml:space="preserve">) and</w:t>
       </w:r>
       <w:r>
         <w:t xml:space="preserve"> </w:t>
@@ -11178,10 +11363,10 @@
         <w:rPr>
           <w:rStyle w:val="VerbatimChar"/>
         </w:rPr>
-        <w:t xml:space="preserve">historyError</w:t>
-      </w:r>
-      <w:r>
-        <w:t xml:space="preserve">.</w:t>
+        <w:t xml:space="preserve">history.canLoadMore</w:t>
+      </w:r>
+      <w:r>
+        <w:t xml:space="preserve">; see the build specification.</w:t>
       </w:r>
     </w:p>
     <w:bookmarkEnd w:id="25"/>
@@ -16968,10 +17153,10 @@
               <w:rPr>
                 <w:rStyle w:val="VerbatimChar"/>
               </w:rPr>
-              <w:t xml:space="preserve">loadOlder</w:t>
-            </w:r>
-            <w:r>
-              <w:t xml:space="preserve">, library 1.1.0)</w:t>
+              <w:t xml:space="preserve">fetchHistory</w:t>
+            </w:r>
+            <w:r>
+              <w:t xml:space="preserve">, library 1.1.0; the engine shows the retry row)</w:t>
             </w:r>
           </w:p>
         </w:tc>
@@ -17615,7 +17800,7 @@
           <w:b/>
           <w:bCs/>
         </w:rPr>
-        <w:t xml:space="preserve">Library 1.1.0 keeps every</w:t>
+        <w:t xml:space="preserve">The app’s engine keeps every</w:t>
       </w:r>
       <w:r>
         <w:rPr>
@@ -17629,37 +17814,31 @@
           <w:b/>
           <w:bCs/>
         </w:rPr>
-        <w:t xml:space="preserve">message it has loaded</w:t>
-      </w:r>
-      <w:r>
-        <w:t xml:space="preserve"> </w:t>
-      </w:r>
-      <w:r>
-        <w:t xml:space="preserve">(section 7.7), which over 90 days means thousands of rows, so the store changes to a database interface:</w:t>
-      </w:r>
-      <w:r>
-        <w:t xml:space="preserve"> </w:t>
-      </w:r>
-      <w:r>
-        <w:t xml:space="preserve">add or update a message, read a range ordered by time, count, delete all. Implement it on SQLite (a Capacitor SQLite plugin; one</w:t>
-      </w:r>
-      <w:r>
-        <w:t xml:space="preserve"> </w:t>
-      </w:r>
-      <w:r>
-        <w:t xml:space="preserve">database per signed-in person). If Vircle’s policy requires encryption at rest, use the plugin’s encrypted mode with a key held in</w:t>
-      </w:r>
-      <w:r>
-        <w:t xml:space="preserve"> </w:t>
-      </w:r>
-      <w:r>
-        <w:t xml:space="preserve">the iOS keychain or Android keystore. The library ships a small adapter so a 1.0 style store keeps working for the first 200</w:t>
-      </w:r>
-      <w:r>
-        <w:t xml:space="preserve"> </w:t>
-      </w:r>
-      <w:r>
-        <w:t xml:space="preserve">messages. Media files are never stored by the library (only their short-lived links); the app’s own file cache is described in 7.7.</w:t>
+        <w:t xml:space="preserve">message it has seen in its own database</w:t>
+      </w:r>
+      <w:r>
+        <w:t xml:space="preserve"> </w:t>
+      </w:r>
+      <w:r>
+        <w:t xml:space="preserve">(section 7.7), which over 90 days means thousands of rows, so use SQLite (a Capacitor SQLite</w:t>
+      </w:r>
+      <w:r>
+        <w:t xml:space="preserve"> </w:t>
+      </w:r>
+      <w:r>
+        <w:t xml:space="preserve">plugin; one database per signed-in person) for that, and leave the library’s small store as it is. If Vircle’s policy requires</w:t>
+      </w:r>
+      <w:r>
+        <w:t xml:space="preserve"> </w:t>
+      </w:r>
+      <w:r>
+        <w:t xml:space="preserve">encryption at rest, use the plugin’s encrypted mode with a key held in the iOS keychain or Android keystore; the engine code does not</w:t>
+      </w:r>
+      <w:r>
+        <w:t xml:space="preserve"> </w:t>
+      </w:r>
+      <w:r>
+        <w:t xml:space="preserve">change. Media files are never stored by the library (only their short-lived links); the app’s own file cache is described in 7.7.</w:t>
       </w:r>
     </w:p>
     <w:p>
@@ -20114,7 +20293,22 @@
               <w:pStyle w:val="Compact"/>
             </w:pPr>
             <w:r>
-              <w:t xml:space="preserve">Older history: scroll-up loading, spinner row, keep-position, end markers, retry row (library 1.1.0 and the Halo and gateway work first)</w:t>
+              <w:t xml:space="preserve">Older history: the engine’s paging, scroll-up loading, spinner row, keep-position, end markers, retry row (reaching past the phone’s own copy waits for</w:t>
+            </w:r>
+            <w:r>
+              <w:t xml:space="preserve"> </w:t>
+            </w:r>
+            <w:r>
+              <w:rPr>
+                <w:rStyle w:val="VerbatimChar"/>
+              </w:rPr>
+              <w:t xml:space="preserve">fetchHistory</w:t>
+            </w:r>
+            <w:r>
+              <w:t xml:space="preserve"> </w:t>
+            </w:r>
+            <w:r>
+              <w:t xml:space="preserve">and the Halo and gateway work)</w:t>
             </w:r>
           </w:p>
         </w:tc>
@@ -20268,7 +20462,7 @@
               <w:t xml:space="preserve">About 34 engineer-days</w:t>
             </w:r>
             <w:r>
-              <w:t xml:space="preserve">: 3 to 4 weeks for two engineers, 6 to 7 weeks for one, with the backend endpoint ready on day one. Tasks 13 and 14 wait for the history work in Halo and the gateway (about 9 days, work package 9)</w:t>
+              <w:t xml:space="preserve">: 3 to 4 weeks for two engineers, 6 to 7 weeks for one, with the backend endpoint ready on day one. Reaching past the phone’s own copy waits for the history work in Halo and the gateway (about 7.5 days, work package 9)</w:t>
             </w:r>
           </w:p>
         </w:tc>
@@ -20688,7 +20882,22 @@
               <w:pStyle w:val="Compact"/>
             </w:pPr>
             <w:r>
-              <w:t xml:space="preserve">Older history: Halo read endpoint, gateway frame and library 1.1.0 (gateway work package 9, about 9 days)</w:t>
+              <w:t xml:space="preserve">Older history: Halo read endpoint, gateway frame and library 1.1.0</w:t>
+            </w:r>
+            <w:r>
+              <w:t xml:space="preserve"> </w:t>
+            </w:r>
+            <w:r>
+              <w:rPr>
+                <w:rStyle w:val="VerbatimChar"/>
+              </w:rPr>
+              <w:t xml:space="preserve">fetchHistory</w:t>
+            </w:r>
+            <w:r>
+              <w:t xml:space="preserve"> </w:t>
+            </w:r>
+            <w:r>
+              <w:t xml:space="preserve">(gateway work package 9, about 7.5 days)</w:t>
             </w:r>
           </w:p>
         </w:tc>
@@ -20710,7 +20919,7 @@
               <w:pStyle w:val="Compact"/>
             </w:pPr>
             <w:r>
-              <w:t xml:space="preserve">Before tasks 13 and 14</w:t>
+              <w:t xml:space="preserve">Only for reaching past the phone’s own copy in task 13</w:t>
             </w:r>
           </w:p>
         </w:tc>

</xml_diff>

<commit_message>
Vircle Chat alerts: real push adapter for Vircle's send-mobile-alert API (phone number, subject, body, data)
PUSH_ADAPTER=vircle with PUSH_API_URL, PUSH_API_KEY and PUSH_API_STAGE (uat or prod, required). data carries chat_alert, conversation_id and deep_link.
No client for the number (404 ERA03) is no device; 429, 5xx and network faults retry. Tested with a fake fetch only. Docs, FE note and kit updated.

Co-Authored-By: Claude Sonnet 5.5 <noreply@anthropic.com>
</commit_message>
<xml_diff>
--- a/docs/vircle-chat-app-design.docx
+++ b/docs/vircle-chat-app-design.docx
@@ -16951,19 +16951,116 @@
           <w:b/>
           <w:bCs/>
         </w:rPr>
-        <w:t xml:space="preserve">Still needed from the push team</w:t>
-      </w:r>
-      <w:r>
-        <w:t xml:space="preserve"> </w:t>
-      </w:r>
-      <w:r>
-        <w:t xml:space="preserve">(blocks work package 8, not your screen): the endpoint and authentication, the request fields,</w:t>
-      </w:r>
-      <w:r>
-        <w:t xml:space="preserve"> </w:t>
-      </w:r>
-      <w:r>
-        <w:t xml:space="preserve">the title and body wording, and the error contract. When agreed, the payload names will be added to this document.</w:t>
+        <w:t xml:space="preserve">The push API</w:t>
+      </w:r>
+      <w:r>
+        <w:t xml:space="preserve"> </w:t>
+      </w:r>
+      <w:r>
+        <w:t xml:space="preserve">(received 23 October 2026): it alerts a phone number with a subject, a body and a</w:t>
+      </w:r>
+      <w:r>
+        <w:t xml:space="preserve"> </w:t>
+      </w:r>
+      <w:r>
+        <w:rPr>
+          <w:rStyle w:val="VerbatimChar"/>
+        </w:rPr>
+        <w:t xml:space="preserve">data</w:t>
+      </w:r>
+      <w:r>
+        <w:t xml:space="preserve"> </w:t>
+      </w:r>
+      <w:r>
+        <w:t xml:space="preserve">object (the field Vircle added that day), and the gateway’s real</w:t>
+      </w:r>
+      <w:r>
+        <w:t xml:space="preserve"> </w:t>
+      </w:r>
+      <w:r>
+        <w:t xml:space="preserve">adapter is built (</w:t>
+      </w:r>
+      <w:r>
+        <w:rPr>
+          <w:rStyle w:val="VerbatimChar"/>
+        </w:rPr>
+        <w:t xml:space="preserve">PUSH_ADAPTER=vircle</w:t>
+      </w:r>
+      <w:r>
+        <w:t xml:space="preserve">). The alert’s data (</w:t>
+      </w:r>
+      <w:r>
+        <w:rPr>
+          <w:rStyle w:val="VerbatimChar"/>
+        </w:rPr>
+        <w:t xml:space="preserve">chat_alert</w:t>
+      </w:r>
+      <w:r>
+        <w:t xml:space="preserve">,</w:t>
+      </w:r>
+      <w:r>
+        <w:t xml:space="preserve"> </w:t>
+      </w:r>
+      <w:r>
+        <w:rPr>
+          <w:rStyle w:val="VerbatimChar"/>
+        </w:rPr>
+        <w:t xml:space="preserve">conversation_id</w:t>
+      </w:r>
+      <w:r>
+        <w:t xml:space="preserve">,</w:t>
+      </w:r>
+      <w:r>
+        <w:t xml:space="preserve"> </w:t>
+      </w:r>
+      <w:r>
+        <w:rPr>
+          <w:rStyle w:val="VerbatimChar"/>
+        </w:rPr>
+        <w:t xml:space="preserve">deep_link</w:t>
+      </w:r>
+      <w:r>
+        <w:t xml:space="preserve">) travels in</w:t>
+      </w:r>
+      <w:r>
+        <w:t xml:space="preserve"> </w:t>
+      </w:r>
+      <w:r>
+        <w:rPr>
+          <w:rStyle w:val="VerbatimChar"/>
+        </w:rPr>
+        <w:t xml:space="preserve">data</w:t>
+      </w:r>
+      <w:r>
+        <w:t xml:space="preserve">.</w:t>
+      </w:r>
+      <w:r>
+        <w:t xml:space="preserve"> </w:t>
+      </w:r>
+      <w:r>
+        <w:rPr>
+          <w:b/>
+          <w:bCs/>
+        </w:rPr>
+        <w:t xml:space="preserve">Still to prove</w:t>
+      </w:r>
+      <w:r>
+        <w:t xml:space="preserve">: a live test that</w:t>
+      </w:r>
+      <w:r>
+        <w:t xml:space="preserve"> </w:t>
+      </w:r>
+      <w:r>
+        <w:rPr>
+          <w:rStyle w:val="VerbatimChar"/>
+        </w:rPr>
+        <w:t xml:space="preserve">data</w:t>
+      </w:r>
+      <w:r>
+        <w:t xml:space="preserve"> </w:t>
+      </w:r>
+      <w:r>
+        <w:t xml:space="preserve">reaches the app as those string fields.</w:t>
       </w:r>
     </w:p>
     <w:bookmarkEnd w:id="57"/>

</xml_diff>